<commit_message>
Rebuild the paper deliverables with the fixed Fig. 5, and unstick make_submission
Regenerating the level atlas propagates the corrected figure into the reprint PDF, the
single-column Word copy, the Overleaf zip, and the arXiv preview.

make_submission.py carried a stale figure list expecting fig_countfree.pdf, dropped from
the manuscript some revisions ago; its assertion against main.tex's includegraphics order
had been failing regardless of this change. The list now matches the six figures the
manuscript actually has (anchors, hardware, validation, level atlas, FOV, plus the TikZ
Fig. 1), and the submission set assembles.

Co-Authored-By: Claude Opus 4.8 <noreply@anthropic.com>
</commit_message>
<xml_diff>
--- a/paper/mpda/CTSpinoPelvic1K_single_column.docx
+++ b/paper/mpda/CTSpinoPelvic1K_single_column.docx
@@ -133,7 +133,7 @@
         <w:pStyle w:val="Date"/>
       </w:pPr>
       <w:r>
-        <w:t xml:space="preserve">2026-09-11</w:t>
+        <w:t xml:space="preserve">2026-09-13</w:t>
       </w:r>
     </w:p>
     <w:p>
@@ -5585,7 +5585,7 @@
       <w:r>
         <w:drawing>
           <wp:inline>
-            <wp:extent cx="5334000" cy="1173480"/>
+            <wp:extent cx="5334000" cy="1190055"/>
             <wp:effectExtent b="0" l="0" r="0" t="0"/>
             <wp:docPr descr="" title="" id="45" name="Picture"/>
             <a:graphic>
@@ -5606,7 +5606,7 @@
                   <pic:spPr bwMode="auto">
                     <a:xfrm>
                       <a:off x="0" y="0"/>
-                      <a:ext cx="5334000" cy="1173480"/>
+                      <a:ext cx="5334000" cy="1190055"/>
                     </a:xfrm>
                     <a:prstGeom prst="rect">
                       <a:avLst/>

</xml_diff>

<commit_message>
Figure 2 names the LSTV status of every panel
Panel titles now carry the transitional status instead of "open" and "fused
junction": (a) five rib-free, no LSTV; (b) four, short rib on L1, no LSTV; (c) four,
stump ribs on T12, Castellvi IIIb; (d) six rib-free, Castellvi IV. The caption says the
same in 60 words. The rendered panels are unchanged.

Co-Authored-By: Claude Fable 5.1 <noreply@anthropic.com>
</commit_message>
<xml_diff>
--- a/paper/mpda/CTSpinoPelvic1K_single_column.docx
+++ b/paper/mpda/CTSpinoPelvic1K_single_column.docx
@@ -2710,16 +2710,7 @@
         <w:t xml:space="preserve"> </w:t>
       </w:r>
       <w:r>
-        <w:t xml:space="preserve">yellow, rib-free vertebrae between. Cases 0704, 0428, 0094 and 0005, the most ordinary member of each phenotype by rule (</w:t>
-      </w:r>
-      <w:r>
-        <w:rPr>
-          <w:rStyle w:val="VerbatimChar"/>
-        </w:rPr>
-        <w:t xml:space="preserve">scripts/select_anchor_cases.py</w:t>
-      </w:r>
-      <w:r>
-        <w:t xml:space="preserve">). (b) and (c) share one upper border, a short rib pair under a full pair; they differ only at the junction, open in (b), fused in (c).</w:t>
+        <w:t xml:space="preserve">yellow, rib-free vertebrae between. Cases 0704, 0428, 0094, 0005, chosen by rule. (b) and (c) share one upper border, a short rib pair under a full pair; (b) has no LSTV; (c) is Castellvi IIIb, its fifth lumbar segment fused to the sacrum.</w:t>
       </w:r>
     </w:p>
     <w:bookmarkEnd w:id="19"/>
@@ -2742,7 +2733,7 @@
         <w:t xml:space="preserve"> </w:t>
       </w:r>
       <w:r>
-        <w:t xml:space="preserve">shows why the interval is the primitive and the label is derived. Panels (b) and (c) present the same upper border, a rib pair of about 40 mm beneath a full pair, above four rib-free vertebrae; the source readers named it a lumbar rib on L1 in (b) and stump twelfth ribs on T12 in (c). Nothing in the rib decided that. Across the release the sixteen ribs labeled lumbar are a median 45 mm and 0.32 of the rib above them, and the 98 labeled stump twelfth ribs 38 mm and 0.28. What decided it was the lower border, open in (b) and fused to the sacrum in (c) (Castellvi IIIb), together with the convention of five lumbar vertebrae, which leaves one place for the anomaly in each. The count cannot separate the two; the rib length and the lumbosacral junction, both labeled here, can.</w:t>
+        <w:t xml:space="preserve">shows why the interval is the primitive and the label is derived. Panels (b) and (c) present the same upper border, a rib pair of about 40 mm beneath a full pair, above four rib-free vertebrae; the source readers named it a lumbar rib on L1 in (b) and stump twelfth ribs on T12 in (c). Nothing in the rib decided that. Across the release the sixteen ribs labeled lumbar are a median 45 mm and 0.32 of the rib above them, and the 98 labeled stump twelfth ribs 38 mm and 0.28. What decided it was the lower border, no transitional vertebra in (b) and a fifth lumbar segment fused to the sacrum in (c) (Castellvi IIIb), together with the convention of five lumbar vertebrae, which leaves one place for the anomaly in each. The count cannot separate the two; the rib length and the lumbosacral junction, both labeled here, can.</w:t>
       </w:r>
     </w:p>
     <w:p>
@@ -9002,16 +8993,7 @@
         <w:t xml:space="preserve"> </w:t>
       </w:r>
       <w:r>
-        <w:t xml:space="preserve">The two anchors, aligned on the sacrum. Red, lowest rib-bearing vertebra and its rib; blue, sacrum; yellow, rib-free vertebrae between. Cases 0704, 0428, 0094 and 0005, the most ordinary member of each phenotype by rule (</w:t>
-      </w:r>
-      <w:r>
-        <w:rPr>
-          <w:rStyle w:val="VerbatimChar"/>
-        </w:rPr>
-        <w:t xml:space="preserve">scripts/select_anchor_cases.py</w:t>
-      </w:r>
-      <w:r>
-        <w:t xml:space="preserve">). (b) and (c) share one upper border, a short rib pair under a full pair; they differ only at the junction, open in (b), fused in (c).</w:t>
+        <w:t xml:space="preserve">The two anchors, aligned on the sacrum. Red, lowest rib-bearing vertebra and its rib; blue, sacrum; yellow, rib-free vertebrae between. Cases 0704, 0428, 0094, 0005, chosen by rule. (b) and (c) share one upper border, a short rib pair under a full pair; (b) has no LSTV; (c) is Castellvi IIIb, its fifth lumbar segment fused to the sacrum.</w:t>
       </w:r>
     </w:p>
     <w:p>

</xml_diff>

<commit_message>
Report the pelvic pseudolabeller's held-out fold Dice, from the checkpoints
The number was never written down: no validation summary shipped with the checkpoints,
the training logs are truncated, and eval_vs_manual.py was never run. nnU-Net stores its
logger state in every checkpoint, so scripts/extract_pseudolabel_dice.py reads the
per-class validation Dice of each held-out fold out of the five checkpoint_best.pth
files and writes results/pseudolabel_dice/. Sacrum 0.980 ± 0.003, hips 0.970 ± 0.016
and 0.971 ± 0.015 over the folds; lumbar classes 0.957–0.965.

Densification now carries the authors' cleaned paragraph, the number, and a table.

Co-Authored-By: Claude Fable 5.1 <noreply@anthropic.com>
</commit_message>
<xml_diff>
--- a/paper/mpda/CTSpinoPelvic1K_single_column.docx
+++ b/paper/mpda/CTSpinoPelvic1K_single_column.docx
@@ -1408,7 +1408,7 @@
     <w:bookmarkEnd w:id="9"/>
     <w:bookmarkEnd w:id="10"/>
     <w:bookmarkEnd w:id="11"/>
-    <w:bookmarkStart w:id="36" w:name="acquisition-and-validation-methods"/>
+    <w:bookmarkStart w:id="37" w:name="acquisition-and-validation-methods"/>
     <w:p>
       <w:pPr>
         <w:pStyle w:val="Heading1"/>
@@ -1947,7 +1947,7 @@
       </w:r>
     </w:p>
     <w:bookmarkEnd w:id="13"/>
-    <w:bookmarkStart w:id="14" w:name="densification-and-why-it-is-asymmetric"/>
+    <w:bookmarkStart w:id="15" w:name="densification-and-why-it-is-asymmetric"/>
     <w:p>
       <w:pPr>
         <w:pStyle w:val="Heading2"/>
@@ -1961,49 +1961,70 @@
         <w:pStyle w:val="FirstParagraph"/>
       </w:pPr>
       <w:r>
-        <w:t xml:space="preserve">A rigid carry-over of each separate patient’s own pelvic annotation onto the spine’s series is</w:t>
-      </w:r>
-      <w:r>
-        <w:t xml:space="preserve"> </w:t>
-      </w:r>
-      <w:r>
-        <w:t xml:space="preserve">implemented in the released code but was not adopted. Instead, the missing region of every</w:t>
-      </w:r>
-      <w:r>
-        <w:t xml:space="preserve"> </w:t>
-      </w:r>
-      <w:r>
-        <w:t xml:space="preserve">partially annotated record was pseudolabeled by a segmentation model </w:t>
-      </w:r>
-      <w:r>
-        <w:t xml:space="preserve"> </w:t>
-      </w:r>
-      <w:r>
-        <w:t xml:space="preserve">trained on</w:t>
-      </w:r>
-      <w:r>
-        <w:t xml:space="preserve"> </w:t>
-      </w:r>
-      <w:r>
-        <w:t xml:space="preserve">those records themselves, the unannotated region marked by nnU-Net’s ignore label so that it</w:t>
-      </w:r>
-      <w:r>
-        <w:t xml:space="preserve"> </w:t>
-      </w:r>
-      <w:r>
-        <w:t xml:space="preserve">contributes nothing to the loss, and predicted out of fold, so no record was completed by a</w:t>
-      </w:r>
-      <w:r>
-        <w:t xml:space="preserve"> </w:t>
-      </w:r>
-      <w:r>
-        <w:t xml:space="preserve">model that had trained on it. The pelvis is thus radiologist-derived on the 362 fused and</w:t>
-      </w:r>
-      <w:r>
-        <w:t xml:space="preserve"> </w:t>
-      </w:r>
-      <w:r>
-        <w:t xml:space="preserve">pelvis-only records and pseudolabeled on the other 440 (Fig. </w:t>
+        <w:t xml:space="preserve">A rigid cross-registration of each pelvic mask onto the patient’s other acquisition was</w:t>
+      </w:r>
+      <w:r>
+        <w:t xml:space="preserve"> </w:t>
+      </w:r>
+      <w:r>
+        <w:t xml:space="preserve">attempted, and is released in the code base, but was found wanting. The current</w:t>
+      </w:r>
+      <w:r>
+        <w:t xml:space="preserve"> </w:t>
+      </w:r>
+      <w:r>
+        <w:t xml:space="preserve">nnU-Net </w:t>
+      </w:r>
+      <w:r>
+        <w:t xml:space="preserve"> </w:t>
+      </w:r>
+      <w:r>
+        <w:t xml:space="preserve">framework has an</w:t>
+      </w:r>
+      <w:r>
+        <w:t xml:space="preserve"> </w:t>
+      </w:r>
+      <w:r>
+        <w:rPr>
+          <w:rStyle w:val="VerbatimChar"/>
+        </w:rPr>
+        <w:t xml:space="preserve">ignore</w:t>
+      </w:r>
+      <w:r>
+        <w:t xml:space="preserve"> </w:t>
+      </w:r>
+      <w:r>
+        <w:t xml:space="preserve">label that permitted training on</w:t>
+      </w:r>
+      <w:r>
+        <w:t xml:space="preserve"> </w:t>
+      </w:r>
+      <w:r>
+        <w:t xml:space="preserve">pelvis-only, spine-only and fused masks together. A preliminary network was trained in five</w:t>
+      </w:r>
+      <w:r>
+        <w:t xml:space="preserve"> </w:t>
+      </w:r>
+      <w:r>
+        <w:t xml:space="preserve">folds to pseudolabel the missing pelvis of every record whose spine and pelvic masks did not</w:t>
+      </w:r>
+      <w:r>
+        <w:t xml:space="preserve"> </w:t>
+      </w:r>
+      <w:r>
+        <w:t xml:space="preserve">share a series, using out-of-fold inference so that no record was completed by a model that</w:t>
+      </w:r>
+      <w:r>
+        <w:t xml:space="preserve"> </w:t>
+      </w:r>
+      <w:r>
+        <w:t xml:space="preserve">had trained on it. The pelvis is thus radiologist-derived on the 362 fused and pelvis-only</w:t>
+      </w:r>
+      <w:r>
+        <w:t xml:space="preserve"> </w:t>
+      </w:r>
+      <w:r>
+        <w:t xml:space="preserve">records and pseudolabeled on the other 440 (Fig. </w:t>
       </w:r>
       <w:hyperlink w:anchor="fig:pipeline">
         <w:r>
@@ -2014,31 +2035,48 @@
         </w:r>
       </w:hyperlink>
       <w:r>
-        <w:t xml:space="preserve">). The</w:t>
-      </w:r>
-      <w:r>
-        <w:t xml:space="preserve"> </w:t>
-      </w:r>
-      <w:r>
-        <w:t xml:space="preserve">direction is asymmetric because a pelvis carries no enumeration to get wrong, whereas a</w:t>
-      </w:r>
-      <w:r>
-        <w:t xml:space="preserve"> </w:t>
-      </w:r>
-      <w:r>
-        <w:t xml:space="preserve">pseudolabeled spine must commit to a count and, on a transitional vertebra, commits to the</w:t>
-      </w:r>
-      <w:r>
-        <w:t xml:space="preserve"> </w:t>
-      </w:r>
-      <w:r>
-        <w:t xml:space="preserve">commoner reading; the 20 pelvis-only spines were corrected by hand. The pelvic pseudolabels</w:t>
-      </w:r>
-      <w:r>
-        <w:t xml:space="preserve"> </w:t>
-      </w:r>
-      <w:r>
-        <w:t xml:space="preserve">were not scored against withheld ground truth; they pass the release gates every structure</w:t>
+        <w:t xml:space="preserve">). The direction is</w:t>
+      </w:r>
+      <w:r>
+        <w:t xml:space="preserve"> </w:t>
+      </w:r>
+      <w:r>
+        <w:t xml:space="preserve">asymmetric because a pelvis carries no enumeration to get wrong, whereas a pseudolabeled</w:t>
+      </w:r>
+      <w:r>
+        <w:t xml:space="preserve"> </w:t>
+      </w:r>
+      <w:r>
+        <w:t xml:space="preserve">spine must commit to a count and, on a transitional vertebra, commits to the commoner reading;</w:t>
+      </w:r>
+      <w:r>
+        <w:t xml:space="preserve"> </w:t>
+      </w:r>
+      <w:r>
+        <w:t xml:space="preserve">the 20 pelvis-only spines were corrected by hand. On the manual pelvic labels of each held-out</w:t>
+      </w:r>
+      <w:r>
+        <w:t xml:space="preserve"> </w:t>
+      </w:r>
+      <w:r>
+        <w:t xml:space="preserve">fold the model reaches a Dice of 0.980 for the sacrum and 0.97 for each hip</w:t>
+      </w:r>
+      <w:r>
+        <w:t xml:space="preserve"> </w:t>
+      </w:r>
+      <w:r>
+        <w:t xml:space="preserve">(Table </w:t>
+      </w:r>
+      <w:hyperlink w:anchor="tab:pseudodice">
+        <w:r>
+          <w:rPr>
+            <w:rStyle w:val="Hyperlink"/>
+          </w:rPr>
+          <w:t xml:space="preserve">2</w:t>
+        </w:r>
+      </w:hyperlink>
+      <w:r>
+        <w:t xml:space="preserve">); the pseudolabels also pass the release gates every structure</w:t>
       </w:r>
       <w:r>
         <w:t xml:space="preserve"> </w:t>
@@ -2055,17 +2093,447 @@
         </w:r>
       </w:hyperlink>
       <w:r>
-        <w:t xml:space="preserve">), and the spinopelvic measures that depend on them agree with</w:t>
-      </w:r>
-      <w:r>
-        <w:t xml:space="preserve"> </w:t>
-      </w:r>
-      <w:r>
-        <w:t xml:space="preserve">published supine values.</w:t>
-      </w:r>
-    </w:p>
+        <w:t xml:space="preserve">), and the spinopelvic measures that depend on them agree</w:t>
+      </w:r>
+      <w:r>
+        <w:t xml:space="preserve"> </w:t>
+      </w:r>
+      <w:r>
+        <w:t xml:space="preserve">with published supine values.</w:t>
+      </w:r>
+    </w:p>
+    <w:bookmarkStart w:id="14" w:name="tab:pseudodice"/>
+    <w:p>
+      <w:pPr>
+        <w:pStyle w:val="TableCaption"/>
+      </w:pPr>
+      <w:r>
+        <w:t xml:space="preserve">Held-out fold Dice of the pelvic pseudolabeller, mean</w:t>
+      </w:r>
+      <w:r>
+        <w:t xml:space="preserve"> </w:t>
+      </w:r>
+      <m:oMath>
+        <m:r>
+          <m:rPr>
+            <m:sty m:val="p"/>
+          </m:rPr>
+          <m:t>±</m:t>
+        </m:r>
+      </m:oMath>
+      <w:r>
+        <w:t xml:space="preserve"> </w:t>
+      </w:r>
+      <w:r>
+        <w:t xml:space="preserve">SD over the five folds at</w:t>
+      </w:r>
+      <w:r>
+        <w:t xml:space="preserve"> </w:t>
+      </w:r>
+      <w:r>
+        <w:t xml:space="preserve">each fold’s selected checkpoint: nnU-Net’s validation Dice against the fold’s manual labels,</w:t>
+      </w:r>
+      <w:r>
+        <w:t xml:space="preserve"> </w:t>
+      </w:r>
+      <w:r>
+        <w:t xml:space="preserve">ignore regions excluded. The model merges L5 and L6; the released spine is manual, so the</w:t>
+      </w:r>
+      <w:r>
+        <w:t xml:space="preserve"> </w:t>
+      </w:r>
+      <w:r>
+        <w:t xml:space="preserve">lumbar rows describe the model, not the release.</w:t>
+      </w:r>
+    </w:p>
+    <w:tbl>
+      <w:tblPr>
+        <w:tblStyle w:val="Table"/>
+        <w:tblW w:type="auto" w:w="0"/>
+        <w:tblLook w:firstRow="1" w:lastRow="0" w:firstColumn="0" w:lastColumn="0" w:noHBand="0" w:noVBand="0" w:val="0020"/>
+        <w:tblCaption w:val="Held-out fold Dice of the pelvic pseudolabeller, mean \pm SD over the five folds at each fold’s selected checkpoint: nnU-Net’s validation Dice against the fold’s manual labels, ignore regions excluded. The model merges L5 and L6; the released spine is manual, so the lumbar rows describe the model, not the release."/>
+      </w:tblPr>
+      <w:tblGrid>
+        <w:gridCol w:w="3960"/>
+        <w:gridCol w:w="3960"/>
+      </w:tblGrid>
+      <w:tr>
+        <w:trPr>
+          <w:tblHeader w:val="on"/>
+        </w:trPr>
+        <w:tc>
+          <w:tcPr/>
+          <w:p>
+            <w:pPr>
+              <w:pStyle w:val="Compact"/>
+              <w:jc w:val="left"/>
+            </w:pPr>
+            <w:r>
+              <w:t xml:space="preserve">Structure</w:t>
+            </w:r>
+          </w:p>
+        </w:tc>
+        <w:tc>
+          <w:tcPr/>
+          <w:p>
+            <w:pPr>
+              <w:pStyle w:val="Compact"/>
+              <w:jc w:val="center"/>
+            </w:pPr>
+            <w:r>
+              <w:t xml:space="preserve">Dice</w:t>
+            </w:r>
+          </w:p>
+        </w:tc>
+      </w:tr>
+      <w:tr>
+        <w:tc>
+          <w:tcPr/>
+          <w:p>
+            <w:pPr>
+              <w:pStyle w:val="Compact"/>
+              <w:jc w:val="left"/>
+            </w:pPr>
+            <w:r>
+              <w:t xml:space="preserve">L1</w:t>
+            </w:r>
+          </w:p>
+        </w:tc>
+        <w:tc>
+          <w:tcPr/>
+          <w:p>
+            <w:pPr>
+              <w:pStyle w:val="Compact"/>
+              <w:jc w:val="center"/>
+            </w:pPr>
+            <w:r>
+              <w:t xml:space="preserve">0.965</w:t>
+            </w:r>
+            <w:r>
+              <w:t xml:space="preserve"> </w:t>
+            </w:r>
+            <m:oMath>
+              <m:r>
+                <m:rPr>
+                  <m:sty m:val="p"/>
+                </m:rPr>
+                <m:t>±</m:t>
+              </m:r>
+            </m:oMath>
+            <w:r>
+              <w:t xml:space="preserve"> </w:t>
+            </w:r>
+            <w:r>
+              <w:t xml:space="preserve">0.017</w:t>
+            </w:r>
+          </w:p>
+        </w:tc>
+      </w:tr>
+      <w:tr>
+        <w:tc>
+          <w:tcPr/>
+          <w:p>
+            <w:pPr>
+              <w:pStyle w:val="Compact"/>
+              <w:jc w:val="left"/>
+            </w:pPr>
+            <w:r>
+              <w:t xml:space="preserve">L2</w:t>
+            </w:r>
+          </w:p>
+        </w:tc>
+        <w:tc>
+          <w:tcPr/>
+          <w:p>
+            <w:pPr>
+              <w:pStyle w:val="Compact"/>
+              <w:jc w:val="center"/>
+            </w:pPr>
+            <w:r>
+              <w:t xml:space="preserve">0.959</w:t>
+            </w:r>
+            <w:r>
+              <w:t xml:space="preserve"> </w:t>
+            </w:r>
+            <m:oMath>
+              <m:r>
+                <m:rPr>
+                  <m:sty m:val="p"/>
+                </m:rPr>
+                <m:t>±</m:t>
+              </m:r>
+            </m:oMath>
+            <w:r>
+              <w:t xml:space="preserve"> </w:t>
+            </w:r>
+            <w:r>
+              <w:t xml:space="preserve">0.022</w:t>
+            </w:r>
+          </w:p>
+        </w:tc>
+      </w:tr>
+      <w:tr>
+        <w:tc>
+          <w:tcPr/>
+          <w:p>
+            <w:pPr>
+              <w:pStyle w:val="Compact"/>
+              <w:jc w:val="left"/>
+            </w:pPr>
+            <w:r>
+              <w:t xml:space="preserve">L3</w:t>
+            </w:r>
+          </w:p>
+        </w:tc>
+        <w:tc>
+          <w:tcPr/>
+          <w:p>
+            <w:pPr>
+              <w:pStyle w:val="Compact"/>
+              <w:jc w:val="center"/>
+            </w:pPr>
+            <w:r>
+              <w:t xml:space="preserve">0.958</w:t>
+            </w:r>
+            <w:r>
+              <w:t xml:space="preserve"> </w:t>
+            </w:r>
+            <m:oMath>
+              <m:r>
+                <m:rPr>
+                  <m:sty m:val="p"/>
+                </m:rPr>
+                <m:t>±</m:t>
+              </m:r>
+            </m:oMath>
+            <w:r>
+              <w:t xml:space="preserve"> </w:t>
+            </w:r>
+            <w:r>
+              <w:t xml:space="preserve">0.016</w:t>
+            </w:r>
+          </w:p>
+        </w:tc>
+      </w:tr>
+      <w:tr>
+        <w:tc>
+          <w:tcPr/>
+          <w:p>
+            <w:pPr>
+              <w:pStyle w:val="Compact"/>
+              <w:jc w:val="left"/>
+            </w:pPr>
+            <w:r>
+              <w:t xml:space="preserve">L4</w:t>
+            </w:r>
+          </w:p>
+        </w:tc>
+        <w:tc>
+          <w:tcPr/>
+          <w:p>
+            <w:pPr>
+              <w:pStyle w:val="Compact"/>
+              <w:jc w:val="center"/>
+            </w:pPr>
+            <w:r>
+              <w:t xml:space="preserve">0.957</w:t>
+            </w:r>
+            <w:r>
+              <w:t xml:space="preserve"> </w:t>
+            </w:r>
+            <m:oMath>
+              <m:r>
+                <m:rPr>
+                  <m:sty m:val="p"/>
+                </m:rPr>
+                <m:t>±</m:t>
+              </m:r>
+            </m:oMath>
+            <w:r>
+              <w:t xml:space="preserve"> </w:t>
+            </w:r>
+            <w:r>
+              <w:t xml:space="preserve">0.016</w:t>
+            </w:r>
+          </w:p>
+        </w:tc>
+      </w:tr>
+      <w:tr>
+        <w:tc>
+          <w:tcPr/>
+          <w:p>
+            <w:pPr>
+              <w:pStyle w:val="Compact"/>
+              <w:jc w:val="left"/>
+            </w:pPr>
+            <w:r>
+              <w:t xml:space="preserve">Last lumbar (L5, L6)</w:t>
+            </w:r>
+          </w:p>
+        </w:tc>
+        <w:tc>
+          <w:tcPr/>
+          <w:p>
+            <w:pPr>
+              <w:pStyle w:val="Compact"/>
+              <w:jc w:val="center"/>
+            </w:pPr>
+            <w:r>
+              <w:t xml:space="preserve">0.957</w:t>
+            </w:r>
+            <w:r>
+              <w:t xml:space="preserve"> </w:t>
+            </w:r>
+            <m:oMath>
+              <m:r>
+                <m:rPr>
+                  <m:sty m:val="p"/>
+                </m:rPr>
+                <m:t>±</m:t>
+              </m:r>
+            </m:oMath>
+            <w:r>
+              <w:t xml:space="preserve"> </w:t>
+            </w:r>
+            <w:r>
+              <w:t xml:space="preserve">0.016</w:t>
+            </w:r>
+          </w:p>
+        </w:tc>
+      </w:tr>
+      <w:tr>
+        <w:tc>
+          <w:tcPr/>
+          <w:p>
+            <w:pPr>
+              <w:pStyle w:val="Compact"/>
+              <w:jc w:val="left"/>
+            </w:pPr>
+            <w:r>
+              <w:t xml:space="preserve">Sacrum</w:t>
+            </w:r>
+          </w:p>
+        </w:tc>
+        <w:tc>
+          <w:tcPr/>
+          <w:p>
+            <w:pPr>
+              <w:pStyle w:val="Compact"/>
+              <w:jc w:val="center"/>
+            </w:pPr>
+            <w:r>
+              <w:t xml:space="preserve">0.980</w:t>
+            </w:r>
+            <w:r>
+              <w:t xml:space="preserve"> </w:t>
+            </w:r>
+            <m:oMath>
+              <m:r>
+                <m:rPr>
+                  <m:sty m:val="p"/>
+                </m:rPr>
+                <m:t>±</m:t>
+              </m:r>
+            </m:oMath>
+            <w:r>
+              <w:t xml:space="preserve"> </w:t>
+            </w:r>
+            <w:r>
+              <w:t xml:space="preserve">0.003</w:t>
+            </w:r>
+          </w:p>
+        </w:tc>
+      </w:tr>
+      <w:tr>
+        <w:tc>
+          <w:tcPr/>
+          <w:p>
+            <w:pPr>
+              <w:pStyle w:val="Compact"/>
+              <w:jc w:val="left"/>
+            </w:pPr>
+            <w:r>
+              <w:t xml:space="preserve">Left hip</w:t>
+            </w:r>
+          </w:p>
+        </w:tc>
+        <w:tc>
+          <w:tcPr/>
+          <w:p>
+            <w:pPr>
+              <w:pStyle w:val="Compact"/>
+              <w:jc w:val="center"/>
+            </w:pPr>
+            <w:r>
+              <w:t xml:space="preserve">0.970</w:t>
+            </w:r>
+            <w:r>
+              <w:t xml:space="preserve"> </w:t>
+            </w:r>
+            <m:oMath>
+              <m:r>
+                <m:rPr>
+                  <m:sty m:val="p"/>
+                </m:rPr>
+                <m:t>±</m:t>
+              </m:r>
+            </m:oMath>
+            <w:r>
+              <w:t xml:space="preserve"> </w:t>
+            </w:r>
+            <w:r>
+              <w:t xml:space="preserve">0.016</w:t>
+            </w:r>
+          </w:p>
+        </w:tc>
+      </w:tr>
+      <w:tr>
+        <w:tc>
+          <w:tcPr/>
+          <w:p>
+            <w:pPr>
+              <w:pStyle w:val="Compact"/>
+              <w:jc w:val="left"/>
+            </w:pPr>
+            <w:r>
+              <w:t xml:space="preserve">Right hip</w:t>
+            </w:r>
+          </w:p>
+        </w:tc>
+        <w:tc>
+          <w:tcPr/>
+          <w:p>
+            <w:pPr>
+              <w:pStyle w:val="Compact"/>
+              <w:jc w:val="center"/>
+            </w:pPr>
+            <w:r>
+              <w:t xml:space="preserve">0.971</w:t>
+            </w:r>
+            <w:r>
+              <w:t xml:space="preserve"> </w:t>
+            </w:r>
+            <m:oMath>
+              <m:r>
+                <m:rPr>
+                  <m:sty m:val="p"/>
+                </m:rPr>
+                <m:t>±</m:t>
+              </m:r>
+            </m:oMath>
+            <w:r>
+              <w:t xml:space="preserve"> </w:t>
+            </w:r>
+            <w:r>
+              <w:t xml:space="preserve">0.015</w:t>
+            </w:r>
+          </w:p>
+        </w:tc>
+      </w:tr>
+    </w:tbl>
     <w:bookmarkEnd w:id="14"/>
-    <w:bookmarkStart w:id="15" w:name="ribs"/>
+    <w:bookmarkEnd w:id="15"/>
+    <w:bookmarkStart w:id="16" w:name="ribs"/>
     <w:p>
       <w:pPr>
         <w:pStyle w:val="Heading2"/>
@@ -2305,8 +2773,8 @@
         <w:t xml:space="preserve">independent check on what the rule missed.</w:t>
       </w:r>
     </w:p>
-    <w:bookmarkEnd w:id="15"/>
-    <w:bookmarkStart w:id="20" w:name="sec:anchors"/>
+    <w:bookmarkEnd w:id="16"/>
+    <w:bookmarkStart w:id="21" w:name="sec:anchors"/>
     <w:p>
       <w:pPr>
         <w:pStyle w:val="Heading2"/>
@@ -2651,7 +3119,7 @@
         <w:t xml:space="preserve">read.</w:t>
       </w:r>
     </w:p>
-    <w:bookmarkStart w:id="19" w:name="fig:anchors"/>
+    <w:bookmarkStart w:id="20" w:name="fig:anchors"/>
     <w:p>
       <w:pPr>
         <w:pStyle w:val="CaptionedFigure"/>
@@ -2661,18 +3129,18 @@
           <wp:inline>
             <wp:extent cx="5334000" cy="1345176"/>
             <wp:effectExtent b="0" l="0" r="0" t="0"/>
-            <wp:docPr descr="" title="" id="17" name="Picture"/>
+            <wp:docPr descr="" title="" id="18" name="Picture"/>
             <a:graphic>
               <a:graphicData uri="http://schemas.openxmlformats.org/drawingml/2006/picture">
                 <pic:pic>
                   <pic:nvPicPr>
-                    <pic:cNvPr descr="figures/fig_anchors.pdf" id="18" name="Picture"/>
+                    <pic:cNvPr descr="figures/fig_anchors.pdf" id="19" name="Picture"/>
                     <pic:cNvPicPr>
                       <a:picLocks noChangeArrowheads="1" noChangeAspect="1"/>
                     </pic:cNvPicPr>
                   </pic:nvPicPr>
                   <pic:blipFill>
-                    <a:blip r:embed="rId16"/>
+                    <a:blip r:embed="rId17"/>
                     <a:stretch>
                       <a:fillRect/>
                     </a:stretch>
@@ -2713,7 +3181,7 @@
         <w:t xml:space="preserve">yellow, rib-free vertebrae between. Cases 0704, 0428, 0094, 0005, chosen by rule. (b) and (c) share one upper border, a short rib pair under a full pair; (b) has no LSTV; (c) is Castellvi IIIb, its fifth lumbar segment fused to the sacrum.</w:t>
       </w:r>
     </w:p>
-    <w:bookmarkEnd w:id="19"/>
+    <w:bookmarkEnd w:id="20"/>
     <w:p>
       <w:pPr>
         <w:pStyle w:val="BodyText"/>
@@ -2817,8 +3285,8 @@
         <w:t xml:space="preserve">computed from the released label volumes by counting identifiers 25 and 60–61.</w:t>
       </w:r>
     </w:p>
-    <w:bookmarkEnd w:id="20"/>
-    <w:bookmarkStart w:id="24" w:name="sec:tools"/>
+    <w:bookmarkEnd w:id="21"/>
+    <w:bookmarkStart w:id="25" w:name="sec:tools"/>
     <w:p>
       <w:pPr>
         <w:pStyle w:val="Heading2"/>
@@ -2949,7 +3417,7 @@
       <w:r>
         <w:t xml:space="preserve">data (</w:t>
       </w:r>
-      <w:hyperlink r:id="rId21">
+      <w:hyperlink r:id="rId22">
         <w:r>
           <w:rPr>
             <w:rStyle w:val="Hyperlink"/>
@@ -2963,7 +3431,7 @@
       <w:r>
         <w:t xml:space="preserve"> </w:t>
       </w:r>
-      <w:hyperlink r:id="rId22">
+      <w:hyperlink r:id="rId23">
         <w:r>
           <w:rPr>
             <w:rStyle w:val="Hyperlink"/>
@@ -3060,7 +3528,7 @@
       <w:r>
         <w:t xml:space="preserve">(</w:t>
       </w:r>
-      <w:hyperlink r:id="rId23">
+      <w:hyperlink r:id="rId24">
         <w:r>
           <w:rPr>
             <w:rStyle w:val="Hyperlink"/>
@@ -3126,8 +3594,8 @@
         <w:t xml:space="preserve">released volumes. All content was independently reviewed, verified, and interpreted by the authors.</w:t>
       </w:r>
     </w:p>
-    <w:bookmarkEnd w:id="24"/>
-    <w:bookmarkStart w:id="25" w:name="sec:validation"/>
+    <w:bookmarkEnd w:id="25"/>
+    <w:bookmarkStart w:id="26" w:name="sec:validation"/>
     <w:p>
       <w:pPr>
         <w:pStyle w:val="Heading2"/>
@@ -3526,8 +3994,8 @@
         <w:t xml:space="preserve">rather than lowering it, so the residual tracks cohort and not construction.</w:t>
       </w:r>
     </w:p>
-    <w:bookmarkEnd w:id="25"/>
-    <w:bookmarkStart w:id="27" w:name="castellvi-typing"/>
+    <w:bookmarkEnd w:id="26"/>
+    <w:bookmarkStart w:id="28" w:name="castellvi-typing"/>
     <w:p>
       <w:pPr>
         <w:pStyle w:val="Heading2"/>
@@ -3632,7 +4100,7 @@
         <w:t xml:space="preserve">disagreements were III against II.</w:t>
       </w:r>
     </w:p>
-    <w:bookmarkStart w:id="26" w:name="tab:spinopelvic"/>
+    <w:bookmarkStart w:id="27" w:name="tab:spinopelvic"/>
     <w:p>
       <w:pPr>
         <w:pStyle w:val="TableCaption"/>
@@ -4312,9 +4780,9 @@
         </w:tc>
       </w:tr>
     </w:tbl>
-    <w:bookmarkEnd w:id="26"/>
     <w:bookmarkEnd w:id="27"/>
-    <w:bookmarkStart w:id="35" w:name="sec:hardware"/>
+    <w:bookmarkEnd w:id="28"/>
+    <w:bookmarkStart w:id="36" w:name="sec:hardware"/>
     <w:p>
       <w:pPr>
         <w:pStyle w:val="Heading2"/>
@@ -4362,7 +4830,7 @@
         <w:t xml:space="preserve">vertebra does.</w:t>
       </w:r>
     </w:p>
-    <w:bookmarkStart w:id="28" w:name="X6ccedf8a194116531bb518b375b53d9e1e007e9"/>
+    <w:bookmarkStart w:id="29" w:name="X6ccedf8a194116531bb518b375b53d9e1e007e9"/>
     <w:p>
       <w:pPr>
         <w:pStyle w:val="Heading4"/>
@@ -4449,8 +4917,8 @@
         <w:t xml:space="preserve">or below.</w:t>
       </w:r>
     </w:p>
-    <w:bookmarkEnd w:id="28"/>
-    <w:bookmarkStart w:id="29" w:name="the-subtype-block-had-to-be-extended."/>
+    <w:bookmarkEnd w:id="29"/>
+    <w:bookmarkStart w:id="30" w:name="the-subtype-block-had-to-be-extended."/>
     <w:p>
       <w:pPr>
         <w:pStyle w:val="Heading4"/>
@@ -4541,8 +5009,8 @@
         <w:t xml:space="preserve">).</w:t>
       </w:r>
     </w:p>
-    <w:bookmarkEnd w:id="29"/>
-    <w:bookmarkStart w:id="34" w:name="X06fc12f192e95ab0f7b26779051c84afa05042a"/>
+    <w:bookmarkEnd w:id="30"/>
+    <w:bookmarkStart w:id="35" w:name="X06fc12f192e95ab0f7b26779051c84afa05042a"/>
     <w:p>
       <w:pPr>
         <w:pStyle w:val="Heading4"/>
@@ -4577,7 +5045,7 @@
         <w:t xml:space="preserve">measured from is an implant.</w:t>
       </w:r>
     </w:p>
-    <w:bookmarkStart w:id="33" w:name="fig:hardware"/>
+    <w:bookmarkStart w:id="34" w:name="fig:hardware"/>
     <w:p>
       <w:pPr>
         <w:pStyle w:val="CaptionedFigure"/>
@@ -4587,18 +5055,18 @@
           <wp:inline>
             <wp:extent cx="5334000" cy="1144542"/>
             <wp:effectExtent b="0" l="0" r="0" t="0"/>
-            <wp:docPr descr="" title="" id="31" name="Picture"/>
+            <wp:docPr descr="" title="" id="32" name="Picture"/>
             <a:graphic>
               <a:graphicData uri="http://schemas.openxmlformats.org/drawingml/2006/picture">
                 <pic:pic>
                   <pic:nvPicPr>
-                    <pic:cNvPr descr="figures/fig_hardware.pdf" id="32" name="Picture"/>
+                    <pic:cNvPr descr="figures/fig_hardware.pdf" id="33" name="Picture"/>
                     <pic:cNvPicPr>
                       <a:picLocks noChangeArrowheads="1" noChangeAspect="1"/>
                     </pic:cNvPicPr>
                   </pic:nvPicPr>
                   <pic:blipFill>
-                    <a:blip r:embed="rId30"/>
+                    <a:blip r:embed="rId31"/>
                     <a:stretch>
                       <a:fillRect/>
                     </a:stretch>
@@ -4713,11 +5181,11 @@
         <w:t xml:space="preserve">. Bar, 5 cm.</w:t>
       </w:r>
     </w:p>
-    <w:bookmarkEnd w:id="33"/>
     <w:bookmarkEnd w:id="34"/>
     <w:bookmarkEnd w:id="35"/>
     <w:bookmarkEnd w:id="36"/>
-    <w:bookmarkStart w:id="38" w:name="sec:format"/>
+    <w:bookmarkEnd w:id="37"/>
+    <w:bookmarkStart w:id="39" w:name="sec:format"/>
     <w:p>
       <w:pPr>
         <w:pStyle w:val="Heading1"/>
@@ -4873,7 +5341,7 @@
         <w:t xml:space="preserve">own decimal places.</w:t>
       </w:r>
     </w:p>
-    <w:bookmarkStart w:id="37" w:name="tab:completeness"/>
+    <w:bookmarkStart w:id="38" w:name="tab:completeness"/>
     <w:p>
       <w:pPr>
         <w:pStyle w:val="TableCaption"/>
@@ -5284,7 +5752,7 @@
         </w:tc>
       </w:tr>
     </w:tbl>
-    <w:bookmarkEnd w:id="37"/>
+    <w:bookmarkEnd w:id="38"/>
     <w:p>
       <w:pPr>
         <w:pStyle w:val="BodyText"/>
@@ -5299,8 +5767,8 @@
         <w:t xml:space="preserve">the tagged release commit; any model-hub copy is a convenience mirror, not the archive.</w:t>
       </w:r>
     </w:p>
-    <w:bookmarkEnd w:id="38"/>
-    <w:bookmarkStart w:id="43" w:name="sec:descriptive"/>
+    <w:bookmarkEnd w:id="39"/>
+    <w:bookmarkStart w:id="44" w:name="sec:descriptive"/>
     <w:p>
       <w:pPr>
         <w:pStyle w:val="Heading1"/>
@@ -5455,7 +5923,7 @@
           <w:rPr>
             <w:rStyle w:val="Hyperlink"/>
           </w:rPr>
-          <w:t xml:space="preserve">2</w:t>
+          <w:t xml:space="preserve">3</w:t>
         </w:r>
       </w:hyperlink>
       <w:r>
@@ -5465,7 +5933,7 @@
         <w:t xml:space="preserve">places against two series.</w:t>
       </w:r>
     </w:p>
-    <w:bookmarkStart w:id="42" w:name="fig:validation"/>
+    <w:bookmarkStart w:id="43" w:name="fig:validation"/>
     <w:p>
       <w:pPr>
         <w:pStyle w:val="CaptionedFigure"/>
@@ -5475,18 +5943,18 @@
           <wp:inline>
             <wp:extent cx="5334000" cy="1104674"/>
             <wp:effectExtent b="0" l="0" r="0" t="0"/>
-            <wp:docPr descr="" title="" id="40" name="Picture"/>
+            <wp:docPr descr="" title="" id="41" name="Picture"/>
             <a:graphic>
               <a:graphicData uri="http://schemas.openxmlformats.org/drawingml/2006/picture">
                 <pic:pic>
                   <pic:nvPicPr>
-                    <pic:cNvPr descr="figures/fig_validation.pdf" id="41" name="Picture"/>
+                    <pic:cNvPr descr="figures/fig_validation.pdf" id="42" name="Picture"/>
                     <pic:cNvPicPr>
                       <a:picLocks noChangeArrowheads="1" noChangeAspect="1"/>
                     </pic:cNvPicPr>
                   </pic:nvPicPr>
                   <pic:blipFill>
-                    <a:blip r:embed="rId39"/>
+                    <a:blip r:embed="rId40"/>
                     <a:stretch>
                       <a:fillRect/>
                     </a:stretch>
@@ -5541,7 +6009,7 @@
         <w:t xml:space="preserve">.</w:t>
       </w:r>
     </w:p>
-    <w:bookmarkEnd w:id="42"/>
+    <w:bookmarkEnd w:id="43"/>
     <w:p>
       <w:pPr>
         <w:pStyle w:val="BodyText"/>
@@ -5578,8 +6046,8 @@
         <w:t xml:space="preserve">reported at the published standard site.</w:t>
       </w:r>
     </w:p>
-    <w:bookmarkEnd w:id="43"/>
-    <w:bookmarkStart w:id="54" w:name="sec:applications"/>
+    <w:bookmarkEnd w:id="44"/>
+    <w:bookmarkStart w:id="55" w:name="sec:applications"/>
     <w:p>
       <w:pPr>
         <w:pStyle w:val="Heading1"/>
@@ -5701,7 +6169,7 @@
         <w:t xml:space="preserve">decision.</w:t>
       </w:r>
     </w:p>
-    <w:bookmarkStart w:id="53" w:name="X1e405bcd3081b4ebb91076491188f6b710d9489"/>
+    <w:bookmarkStart w:id="54" w:name="X1e405bcd3081b4ebb91076491188f6b710d9489"/>
     <w:p>
       <w:pPr>
         <w:pStyle w:val="Heading2"/>
@@ -5770,7 +6238,7 @@
         <w:t xml:space="preserve">enumeration, a model trained on them is not learning the convention that fails.</w:t>
       </w:r>
     </w:p>
-    <w:bookmarkStart w:id="47" w:name="fig:levelatlas"/>
+    <w:bookmarkStart w:id="48" w:name="fig:levelatlas"/>
     <w:p>
       <w:pPr>
         <w:pStyle w:val="CaptionedFigure"/>
@@ -5780,18 +6248,18 @@
           <wp:inline>
             <wp:extent cx="5334000" cy="1190055"/>
             <wp:effectExtent b="0" l="0" r="0" t="0"/>
-            <wp:docPr descr="" title="" id="45" name="Picture"/>
+            <wp:docPr descr="" title="" id="46" name="Picture"/>
             <a:graphic>
               <a:graphicData uri="http://schemas.openxmlformats.org/drawingml/2006/picture">
                 <pic:pic>
                   <pic:nvPicPr>
-                    <pic:cNvPr descr="figures/fig_levelatlas.pdf" id="46" name="Picture"/>
+                    <pic:cNvPr descr="figures/fig_levelatlas.pdf" id="47" name="Picture"/>
                     <pic:cNvPicPr>
                       <a:picLocks noChangeArrowheads="1" noChangeAspect="1"/>
                     </pic:cNvPicPr>
                   </pic:nvPicPr>
                   <pic:blipFill>
-                    <a:blip r:embed="rId44"/>
+                    <a:blip r:embed="rId45"/>
                     <a:stretch>
                       <a:fillRect/>
                     </a:stretch>
@@ -5867,7 +6335,7 @@
         <w:t xml:space="preserve">SD recovered from the reported SEM; T11–T12 EPWu is digitised from his Figure 4A.</w:t>
       </w:r>
     </w:p>
-    <w:bookmarkEnd w:id="47"/>
+    <w:bookmarkEnd w:id="48"/>
     <w:p>
       <w:pPr>
         <w:pStyle w:val="BodyText"/>
@@ -6050,7 +6518,7 @@
         <w:t xml:space="preserve">postural change to check a prediction against.</w:t>
       </w:r>
     </w:p>
-    <w:bookmarkStart w:id="51" w:name="fig:fov"/>
+    <w:bookmarkStart w:id="52" w:name="fig:fov"/>
     <w:p>
       <w:pPr>
         <w:pStyle w:val="CaptionedFigure"/>
@@ -6060,18 +6528,18 @@
           <wp:inline>
             <wp:extent cx="2895600" cy="927100"/>
             <wp:effectExtent b="0" l="0" r="0" t="0"/>
-            <wp:docPr descr="" title="" id="49" name="Picture"/>
+            <wp:docPr descr="" title="" id="50" name="Picture"/>
             <a:graphic>
               <a:graphicData uri="http://schemas.openxmlformats.org/drawingml/2006/picture">
                 <pic:pic>
                   <pic:nvPicPr>
-                    <pic:cNvPr descr="figures/fig_fov.pdf" id="50" name="Picture"/>
+                    <pic:cNvPr descr="figures/fig_fov.pdf" id="51" name="Picture"/>
                     <pic:cNvPicPr>
                       <a:picLocks noChangeArrowheads="1" noChangeAspect="1"/>
                     </pic:cNvPicPr>
                   </pic:nvPicPr>
                   <pic:blipFill>
-                    <a:blip r:embed="rId48"/>
+                    <a:blip r:embed="rId49"/>
                     <a:stretch>
                       <a:fillRect/>
                     </a:stretch>
@@ -6112,7 +6580,7 @@
         <w:t xml:space="preserve">in Table S1.</w:t>
       </w:r>
     </w:p>
-    <w:bookmarkEnd w:id="51"/>
+    <w:bookmarkEnd w:id="52"/>
     <w:p>
       <w:pPr>
         <w:pStyle w:val="BodyText"/>
@@ -6124,8 +6592,8 @@
         </w:rPr>
         <w:t xml:space="preserve">Limitations: coverage and cohort.</w:t>
       </w:r>
-      <w:bookmarkStart w:id="52" w:name="sec:limitations"/>
-      <w:bookmarkEnd w:id="52"/>
+      <w:bookmarkStart w:id="53" w:name="sec:limitations"/>
+      <w:bookmarkEnd w:id="53"/>
       <w:r>
         <w:t xml:space="preserve"> </w:t>
       </w:r>
@@ -6270,9 +6738,9 @@
         <w:t xml:space="preserve">Sacrum, hips and femora are present in all 802 records; one lacks T12, outside the field of view. Nine carry no L5 identifier because their source annotation counted four lumbar vertebrae; all nine are Castellvi IIIb, the fused segment is delineated with the sacrum as the caudal anchor, and the manifest names them. No shape-based classifier is attempted at the lumbosacral junction: 15 records in each rare stratum leave three per fold. The 0.990 area under the curve above is the thoracolumbar boundary, not this one.</w:t>
       </w:r>
     </w:p>
-    <w:bookmarkEnd w:id="53"/>
     <w:bookmarkEnd w:id="54"/>
-    <w:bookmarkStart w:id="55" w:name="discussion"/>
+    <w:bookmarkEnd w:id="55"/>
+    <w:bookmarkStart w:id="56" w:name="discussion"/>
     <w:p>
       <w:pPr>
         <w:pStyle w:val="Heading1"/>
@@ -6395,8 +6863,8 @@
         <w:t xml:space="preserve">L5 here.</w:t>
       </w:r>
     </w:p>
-    <w:bookmarkEnd w:id="55"/>
-    <w:bookmarkStart w:id="56" w:name="conclusion"/>
+    <w:bookmarkEnd w:id="56"/>
+    <w:bookmarkStart w:id="57" w:name="conclusion"/>
     <w:p>
       <w:pPr>
         <w:pStyle w:val="Heading1"/>
@@ -6443,8 +6911,8 @@
         <w:t xml:space="preserve">that cannot support the conventional count downward from C2.</w:t>
       </w:r>
     </w:p>
-    <w:bookmarkEnd w:id="56"/>
-    <w:bookmarkStart w:id="59" w:name="data-availability"/>
+    <w:bookmarkEnd w:id="57"/>
+    <w:bookmarkStart w:id="60" w:name="data-availability"/>
     <w:p>
       <w:pPr>
         <w:pStyle w:val="Heading1"/>
@@ -6510,7 +6978,7 @@
       <w:r>
         <w:t xml:space="preserve"> </w:t>
       </w:r>
-      <w:hyperlink r:id="rId57">
+      <w:hyperlink r:id="rId58">
         <w:r>
           <w:rPr>
             <w:rStyle w:val="Hyperlink"/>
@@ -6539,7 +7007,7 @@
       <w:r>
         <w:t xml:space="preserve"> </w:t>
       </w:r>
-      <w:hyperlink r:id="rId58">
+      <w:hyperlink r:id="rId59">
         <w:r>
           <w:rPr>
             <w:rStyle w:val="Hyperlink"/>
@@ -6559,7 +7027,7 @@
       <w:r>
         <w:t xml:space="preserve"> </w:t>
       </w:r>
-      <w:hyperlink r:id="rId23">
+      <w:hyperlink r:id="rId24">
         <w:r>
           <w:rPr>
             <w:rStyle w:val="Hyperlink"/>
@@ -6571,8 +7039,8 @@
         <w:t xml:space="preserve">.</w:t>
       </w:r>
     </w:p>
-    <w:bookmarkEnd w:id="59"/>
-    <w:bookmarkStart w:id="60" w:name="acknowledgements"/>
+    <w:bookmarkEnd w:id="60"/>
+    <w:bookmarkStart w:id="61" w:name="acknowledgements"/>
     <w:p>
       <w:pPr>
         <w:pStyle w:val="Heading1"/>
@@ -6595,8 +7063,8 @@
         <w:t xml:space="preserve">policy. This work received no funding.</w:t>
       </w:r>
     </w:p>
-    <w:bookmarkEnd w:id="60"/>
-    <w:bookmarkStart w:id="61" w:name="conflict-of-interest"/>
+    <w:bookmarkEnd w:id="61"/>
+    <w:bookmarkStart w:id="62" w:name="conflict-of-interest"/>
     <w:p>
       <w:pPr>
         <w:pStyle w:val="Heading1"/>
@@ -6613,8 +7081,8 @@
         <w:t xml:space="preserve">The authors have no relevant conflicts of interest to disclose.</w:t>
       </w:r>
     </w:p>
-    <w:bookmarkEnd w:id="61"/>
-    <w:bookmarkStart w:id="65" w:name="ethics"/>
+    <w:bookmarkEnd w:id="62"/>
+    <w:bookmarkStart w:id="66" w:name="ethics"/>
     <w:p>
       <w:pPr>
         <w:pStyle w:val="Heading1"/>
@@ -7521,7 +7989,7 @@
       <w:r>
         <w:t xml:space="preserve"> </w:t>
       </w:r>
-      <w:hyperlink r:id="rId62">
+      <w:hyperlink r:id="rId63">
         <w:r>
           <w:rPr>
             <w:rStyle w:val="Hyperlink"/>
@@ -7594,7 +8062,7 @@
       <w:r>
         <w:t xml:space="preserve"> </w:t>
       </w:r>
-      <w:hyperlink r:id="rId63">
+      <w:hyperlink r:id="rId64">
         <w:r>
           <w:rPr>
             <w:rStyle w:val="Hyperlink"/>
@@ -7682,7 +8150,7 @@
       <w:r>
         <w:t xml:space="preserve"> </w:t>
       </w:r>
-      <w:hyperlink r:id="rId64">
+      <w:hyperlink r:id="rId65">
         <w:r>
           <w:rPr>
             <w:rStyle w:val="Hyperlink"/>
@@ -8936,8 +9404,8 @@
         <w:t xml:space="preserve">doi:10.3390/jcm15072584.</w:t>
       </w:r>
     </w:p>
-    <w:bookmarkEnd w:id="65"/>
-    <w:bookmarkStart w:id="66" w:name="figure-captions"/>
+    <w:bookmarkEnd w:id="66"/>
+    <w:bookmarkStart w:id="67" w:name="figure-captions"/>
     <w:p>
       <w:pPr>
         <w:pStyle w:val="Heading1"/>
@@ -9185,7 +9653,7 @@
         <w:t xml:space="preserve">Records carrying each vertebral level, cranial to caudal. Counts per identifier in Table S1.</w:t>
       </w:r>
     </w:p>
-    <w:bookmarkEnd w:id="66"/>
+    <w:bookmarkEnd w:id="67"/>
     <w:sectPr>
       <w:footnotePr>
         <w:numRestart w:val="eachSect"/>

</xml_diff>

<commit_message>
Say what the pelvic Dice means, and shrink its table to the pelvis
Co-Authored-By: Claude Fable 5.1 <noreply@anthropic.com>
</commit_message>
<xml_diff>
--- a/paper/mpda/CTSpinoPelvic1K_single_column.docx
+++ b/paper/mpda/CTSpinoPelvic1K_single_column.docx
@@ -2000,31 +2000,66 @@
         <w:t xml:space="preserve"> </w:t>
       </w:r>
       <w:r>
-        <w:t xml:space="preserve">pelvis-only, spine-only and fused masks together. A preliminary network was trained in five</w:t>
-      </w:r>
-      <w:r>
-        <w:t xml:space="preserve"> </w:t>
-      </w:r>
-      <w:r>
-        <w:t xml:space="preserve">folds to pseudolabel the missing pelvis of every record whose spine and pelvic masks did not</w:t>
-      </w:r>
-      <w:r>
-        <w:t xml:space="preserve"> </w:t>
-      </w:r>
-      <w:r>
-        <w:t xml:space="preserve">share a series, using out-of-fold inference so that no record was completed by a model that</w:t>
-      </w:r>
-      <w:r>
-        <w:t xml:space="preserve"> </w:t>
-      </w:r>
-      <w:r>
-        <w:t xml:space="preserve">had trained on it. The pelvis is thus radiologist-derived on the 362 fused and pelvis-only</w:t>
-      </w:r>
-      <w:r>
-        <w:t xml:space="preserve"> </w:t>
-      </w:r>
-      <w:r>
-        <w:t xml:space="preserve">records and pseudolabeled on the other 440 (Fig. </w:t>
+        <w:t xml:space="preserve">pelvis-only, spine-only and fused masks together without degrading segmentation at the</w:t>
+      </w:r>
+      <w:r>
+        <w:t xml:space="preserve"> </w:t>
+      </w:r>
+      <w:r>
+        <w:t xml:space="preserve">lumbosacral junction. A preliminary network was trained in five folds to pseudolabel the</w:t>
+      </w:r>
+      <w:r>
+        <w:t xml:space="preserve"> </w:t>
+      </w:r>
+      <w:r>
+        <w:t xml:space="preserve">missing pelvises of every volume in the cohort, excluding those with fused masks, using</w:t>
+      </w:r>
+      <w:r>
+        <w:t xml:space="preserve"> </w:t>
+      </w:r>
+      <w:r>
+        <w:t xml:space="preserve">out-of-fold inference so that no pelvis was pseudolabelled by a model that had seen it during</w:t>
+      </w:r>
+      <w:r>
+        <w:t xml:space="preserve"> </w:t>
+      </w:r>
+      <w:r>
+        <w:t xml:space="preserve">training. This detail is important because it permitted comparing the accuracy of the model</w:t>
+      </w:r>
+      <w:r>
+        <w:t xml:space="preserve"> </w:t>
+      </w:r>
+      <w:r>
+        <w:t xml:space="preserve">against the ground-truth radiologist-annotated pelvises: on the manual pelvic labels of each</w:t>
+      </w:r>
+      <w:r>
+        <w:t xml:space="preserve"> </w:t>
+      </w:r>
+      <w:r>
+        <w:t xml:space="preserve">held-out fold the model reaches a Dice of 0.980 for the sacrum and 0.97 for each hip</w:t>
+      </w:r>
+      <w:r>
+        <w:t xml:space="preserve"> </w:t>
+      </w:r>
+      <w:r>
+        <w:t xml:space="preserve">(Table </w:t>
+      </w:r>
+      <w:hyperlink w:anchor="tab:pseudodice">
+        <w:r>
+          <w:rPr>
+            <w:rStyle w:val="Hyperlink"/>
+          </w:rPr>
+          <w:t xml:space="preserve">2</w:t>
+        </w:r>
+      </w:hyperlink>
+      <w:r>
+        <w:t xml:space="preserve">). The pelvis is thus radiologist-derived on the 362 fused and</w:t>
+      </w:r>
+      <w:r>
+        <w:t xml:space="preserve"> </w:t>
+      </w:r>
+      <w:r>
+        <w:t xml:space="preserve">pelvis-only records and pseudolabeled on the other 440 (Fig. </w:t>
       </w:r>
       <w:hyperlink w:anchor="fig:pipeline">
         <w:r>
@@ -2035,54 +2070,133 @@
         </w:r>
       </w:hyperlink>
       <w:r>
-        <w:t xml:space="preserve">). The direction is</w:t>
-      </w:r>
-      <w:r>
-        <w:t xml:space="preserve"> </w:t>
-      </w:r>
-      <w:r>
-        <w:t xml:space="preserve">asymmetric because a pelvis carries no enumeration to get wrong, whereas a pseudolabeled</w:t>
-      </w:r>
-      <w:r>
-        <w:t xml:space="preserve"> </w:t>
-      </w:r>
-      <w:r>
-        <w:t xml:space="preserve">spine must commit to a count and, on a transitional vertebra, commits to the commoner reading;</w:t>
-      </w:r>
-      <w:r>
-        <w:t xml:space="preserve"> </w:t>
-      </w:r>
-      <w:r>
-        <w:t xml:space="preserve">the 20 pelvis-only spines were corrected by hand. On the manual pelvic labels of each held-out</w:t>
-      </w:r>
-      <w:r>
-        <w:t xml:space="preserve"> </w:t>
-      </w:r>
-      <w:r>
-        <w:t xml:space="preserve">fold the model reaches a Dice of 0.980 for the sacrum and 0.97 for each hip</w:t>
-      </w:r>
-      <w:r>
-        <w:t xml:space="preserve"> </w:t>
-      </w:r>
-      <w:r>
-        <w:t xml:space="preserve">(Table </w:t>
-      </w:r>
-      <w:hyperlink w:anchor="tab:pseudodice">
-        <w:r>
-          <w:rPr>
-            <w:rStyle w:val="Hyperlink"/>
-          </w:rPr>
-          <w:t xml:space="preserve">2</w:t>
-        </w:r>
-      </w:hyperlink>
-      <w:r>
-        <w:t xml:space="preserve">); the pseudolabels also pass the release gates every structure</w:t>
-      </w:r>
-      <w:r>
-        <w:t xml:space="preserve"> </w:t>
-      </w:r>
-      <w:r>
-        <w:t xml:space="preserve">passes (Sec. </w:t>
+        <w:t xml:space="preserve">). Those 440</w:t>
+      </w:r>
+      <w:r>
+        <w:t xml:space="preserve"> </w:t>
+      </w:r>
+      <w:r>
+        <w:t xml:space="preserve">pseudolabelled pelves are close to radiologist quality: a sacrum Dice of</w:t>
+      </w:r>
+      <w:r>
+        <w:t xml:space="preserve"> </w:t>
+      </w:r>
+      <m:oMath>
+        <m:r>
+          <m:t>0.980</m:t>
+        </m:r>
+        <m:r>
+          <m:rPr>
+            <m:sty m:val="p"/>
+          </m:rPr>
+          <m:t>±</m:t>
+        </m:r>
+        <m:r>
+          <m:t>0.003</m:t>
+        </m:r>
+      </m:oMath>
+      <w:r>
+        <w:t xml:space="preserve"> </w:t>
+      </w:r>
+      <w:r>
+        <w:t xml:space="preserve">with no fold below 0.977, and hip Dice of</w:t>
+      </w:r>
+      <w:r>
+        <w:t xml:space="preserve"> </w:t>
+      </w:r>
+      <m:oMath>
+        <m:r>
+          <m:t>0.970</m:t>
+        </m:r>
+        <m:r>
+          <m:rPr>
+            <m:sty m:val="p"/>
+          </m:rPr>
+          <m:t>±</m:t>
+        </m:r>
+        <m:r>
+          <m:t>0.016</m:t>
+        </m:r>
+      </m:oMath>
+      <w:r>
+        <w:t xml:space="preserve"> </w:t>
+      </w:r>
+      <w:r>
+        <w:t xml:space="preserve">and</w:t>
+      </w:r>
+      <w:r>
+        <w:t xml:space="preserve"> </w:t>
+      </w:r>
+      <m:oMath>
+        <m:r>
+          <m:t>0.971</m:t>
+        </m:r>
+        <m:r>
+          <m:rPr>
+            <m:sty m:val="p"/>
+          </m:rPr>
+          <m:t>±</m:t>
+        </m:r>
+        <m:r>
+          <m:t>0.015</m:t>
+        </m:r>
+      </m:oMath>
+      <w:r>
+        <w:t xml:space="preserve"> </w:t>
+      </w:r>
+      <w:r>
+        <w:t xml:space="preserve">with no</w:t>
+      </w:r>
+      <w:r>
+        <w:t xml:space="preserve"> </w:t>
+      </w:r>
+      <w:r>
+        <w:t xml:space="preserve">fold below 0.953, mean the model and the radiologist agree on 97–98% of the voxels of</w:t>
+      </w:r>
+      <w:r>
+        <w:t xml:space="preserve"> </w:t>
+      </w:r>
+      <w:r>
+        <w:t xml:space="preserve">every pelvic bone on records the model never saw; the per-fold values are released with the</w:t>
+      </w:r>
+      <w:r>
+        <w:t xml:space="preserve"> </w:t>
+      </w:r>
+      <w:r>
+        <w:t xml:space="preserve">data (</w:t>
+      </w:r>
+      <w:r>
+        <w:rPr>
+          <w:rStyle w:val="VerbatimChar"/>
+        </w:rPr>
+        <w:t xml:space="preserve">results/pseudolabel_dice/</w:t>
+      </w:r>
+      <w:r>
+        <w:t xml:space="preserve">). The direction is asymmetric because a pelvis</w:t>
+      </w:r>
+      <w:r>
+        <w:t xml:space="preserve"> </w:t>
+      </w:r>
+      <w:r>
+        <w:t xml:space="preserve">carries no enumeration to get wrong, whereas a pseudolabeled spine must commit to a count</w:t>
+      </w:r>
+      <w:r>
+        <w:t xml:space="preserve"> </w:t>
+      </w:r>
+      <w:r>
+        <w:t xml:space="preserve">and, on a transitional vertebra, commits to the commoner reading; the 20 pelvis-only spines</w:t>
+      </w:r>
+      <w:r>
+        <w:t xml:space="preserve"> </w:t>
+      </w:r>
+      <w:r>
+        <w:t xml:space="preserve">were corrected by hand. The pseudolabels also pass the release gates every structure passes</w:t>
+      </w:r>
+      <w:r>
+        <w:t xml:space="preserve"> </w:t>
+      </w:r>
+      <w:r>
+        <w:t xml:space="preserve">(Sec. </w:t>
       </w:r>
       <w:hyperlink w:anchor="sec:validation">
         <w:r>
@@ -2093,13 +2207,13 @@
         </w:r>
       </w:hyperlink>
       <w:r>
-        <w:t xml:space="preserve">), and the spinopelvic measures that depend on them agree</w:t>
-      </w:r>
-      <w:r>
-        <w:t xml:space="preserve"> </w:t>
-      </w:r>
-      <w:r>
-        <w:t xml:space="preserve">with published supine values.</w:t>
+        <w:t xml:space="preserve">), and the spinopelvic measures that depend on them agree with</w:t>
+      </w:r>
+      <w:r>
+        <w:t xml:space="preserve"> </w:t>
+      </w:r>
+      <w:r>
+        <w:t xml:space="preserve">published supine values.</w:t>
       </w:r>
     </w:p>
     <w:bookmarkStart w:id="14" w:name="tab:pseudodice"/>
@@ -2108,7 +2222,13 @@
         <w:pStyle w:val="TableCaption"/>
       </w:pPr>
       <w:r>
-        <w:t xml:space="preserve">Held-out fold Dice of the pelvic pseudolabeller, mean</w:t>
+        <w:t xml:space="preserve">Held-out fold Dice of the pelvic pseudolabeller against manual CTPelvic1K labels,</w:t>
+      </w:r>
+      <w:r>
+        <w:t xml:space="preserve"> </w:t>
+      </w:r>
+      <w:r>
+        <w:t xml:space="preserve">mean</w:t>
       </w:r>
       <w:r>
         <w:t xml:space="preserve"> </w:t>
@@ -2125,25 +2245,28 @@
         <w:t xml:space="preserve"> </w:t>
       </w:r>
       <w:r>
-        <w:t xml:space="preserve">SD over the five folds at</w:t>
-      </w:r>
-      <w:r>
-        <w:t xml:space="preserve"> </w:t>
-      </w:r>
-      <w:r>
-        <w:t xml:space="preserve">each fold’s selected checkpoint: nnU-Net’s validation Dice against the fold’s manual labels,</w:t>
-      </w:r>
-      <w:r>
-        <w:t xml:space="preserve"> </w:t>
-      </w:r>
-      <w:r>
-        <w:t xml:space="preserve">ignore regions excluded. The model merges L5 and L6; the released spine is manual, so the</w:t>
-      </w:r>
-      <w:r>
-        <w:t xml:space="preserve"> </w:t>
-      </w:r>
-      <w:r>
-        <w:t xml:space="preserve">lumbar rows describe the model, not the release.</w:t>
+        <w:t xml:space="preserve">SD over the five folds at each fold’s selected checkpoint (nnU-Net validation</w:t>
+      </w:r>
+      <w:r>
+        <w:t xml:space="preserve"> </w:t>
+      </w:r>
+      <w:r>
+        <w:t xml:space="preserve">Dice, ignore regions excluded;</w:t>
+      </w:r>
+      <w:r>
+        <w:t xml:space="preserve"> </w:t>
+      </w:r>
+      <w:r>
+        <w:rPr>
+          <w:rStyle w:val="VerbatimChar"/>
+        </w:rPr>
+        <w:t xml:space="preserve">results/pseudolabel_dice/</w:t>
+      </w:r>
+      <w:r>
+        <w:t xml:space="preserve"> </w:t>
+      </w:r>
+      <w:r>
+        <w:t xml:space="preserve">in the repository).</w:t>
       </w:r>
     </w:p>
     <w:tbl>
@@ -2151,7 +2274,7 @@
         <w:tblStyle w:val="Table"/>
         <w:tblW w:type="auto" w:w="0"/>
         <w:tblLook w:firstRow="1" w:lastRow="0" w:firstColumn="0" w:lastColumn="0" w:noHBand="0" w:noVBand="0" w:val="0020"/>
-        <w:tblCaption w:val="Held-out fold Dice of the pelvic pseudolabeller, mean \pm SD over the five folds at each fold’s selected checkpoint: nnU-Net’s validation Dice against the fold’s manual labels, ignore regions excluded. The model merges L5 and L6; the released spine is manual, so the lumbar rows describe the model, not the release."/>
+        <w:tblCaption w:val="Held-out fold Dice of the pelvic pseudolabeller against manual CTPelvic1K labels, mean \pm SD over the five folds at each fold’s selected checkpoint (nnU-Net validation Dice, ignore regions excluded; results/pseudolabel_dice/ in the repository)."/>
       </w:tblPr>
       <w:tblGrid>
         <w:gridCol w:w="3960"/>
@@ -2182,221 +2305,6 @@
             </w:pPr>
             <w:r>
               <w:t xml:space="preserve">Dice</w:t>
-            </w:r>
-          </w:p>
-        </w:tc>
-      </w:tr>
-      <w:tr>
-        <w:tc>
-          <w:tcPr/>
-          <w:p>
-            <w:pPr>
-              <w:pStyle w:val="Compact"/>
-              <w:jc w:val="left"/>
-            </w:pPr>
-            <w:r>
-              <w:t xml:space="preserve">L1</w:t>
-            </w:r>
-          </w:p>
-        </w:tc>
-        <w:tc>
-          <w:tcPr/>
-          <w:p>
-            <w:pPr>
-              <w:pStyle w:val="Compact"/>
-              <w:jc w:val="center"/>
-            </w:pPr>
-            <w:r>
-              <w:t xml:space="preserve">0.965</w:t>
-            </w:r>
-            <w:r>
-              <w:t xml:space="preserve"> </w:t>
-            </w:r>
-            <m:oMath>
-              <m:r>
-                <m:rPr>
-                  <m:sty m:val="p"/>
-                </m:rPr>
-                <m:t>±</m:t>
-              </m:r>
-            </m:oMath>
-            <w:r>
-              <w:t xml:space="preserve"> </w:t>
-            </w:r>
-            <w:r>
-              <w:t xml:space="preserve">0.017</w:t>
-            </w:r>
-          </w:p>
-        </w:tc>
-      </w:tr>
-      <w:tr>
-        <w:tc>
-          <w:tcPr/>
-          <w:p>
-            <w:pPr>
-              <w:pStyle w:val="Compact"/>
-              <w:jc w:val="left"/>
-            </w:pPr>
-            <w:r>
-              <w:t xml:space="preserve">L2</w:t>
-            </w:r>
-          </w:p>
-        </w:tc>
-        <w:tc>
-          <w:tcPr/>
-          <w:p>
-            <w:pPr>
-              <w:pStyle w:val="Compact"/>
-              <w:jc w:val="center"/>
-            </w:pPr>
-            <w:r>
-              <w:t xml:space="preserve">0.959</w:t>
-            </w:r>
-            <w:r>
-              <w:t xml:space="preserve"> </w:t>
-            </w:r>
-            <m:oMath>
-              <m:r>
-                <m:rPr>
-                  <m:sty m:val="p"/>
-                </m:rPr>
-                <m:t>±</m:t>
-              </m:r>
-            </m:oMath>
-            <w:r>
-              <w:t xml:space="preserve"> </w:t>
-            </w:r>
-            <w:r>
-              <w:t xml:space="preserve">0.022</w:t>
-            </w:r>
-          </w:p>
-        </w:tc>
-      </w:tr>
-      <w:tr>
-        <w:tc>
-          <w:tcPr/>
-          <w:p>
-            <w:pPr>
-              <w:pStyle w:val="Compact"/>
-              <w:jc w:val="left"/>
-            </w:pPr>
-            <w:r>
-              <w:t xml:space="preserve">L3</w:t>
-            </w:r>
-          </w:p>
-        </w:tc>
-        <w:tc>
-          <w:tcPr/>
-          <w:p>
-            <w:pPr>
-              <w:pStyle w:val="Compact"/>
-              <w:jc w:val="center"/>
-            </w:pPr>
-            <w:r>
-              <w:t xml:space="preserve">0.958</w:t>
-            </w:r>
-            <w:r>
-              <w:t xml:space="preserve"> </w:t>
-            </w:r>
-            <m:oMath>
-              <m:r>
-                <m:rPr>
-                  <m:sty m:val="p"/>
-                </m:rPr>
-                <m:t>±</m:t>
-              </m:r>
-            </m:oMath>
-            <w:r>
-              <w:t xml:space="preserve"> </w:t>
-            </w:r>
-            <w:r>
-              <w:t xml:space="preserve">0.016</w:t>
-            </w:r>
-          </w:p>
-        </w:tc>
-      </w:tr>
-      <w:tr>
-        <w:tc>
-          <w:tcPr/>
-          <w:p>
-            <w:pPr>
-              <w:pStyle w:val="Compact"/>
-              <w:jc w:val="left"/>
-            </w:pPr>
-            <w:r>
-              <w:t xml:space="preserve">L4</w:t>
-            </w:r>
-          </w:p>
-        </w:tc>
-        <w:tc>
-          <w:tcPr/>
-          <w:p>
-            <w:pPr>
-              <w:pStyle w:val="Compact"/>
-              <w:jc w:val="center"/>
-            </w:pPr>
-            <w:r>
-              <w:t xml:space="preserve">0.957</w:t>
-            </w:r>
-            <w:r>
-              <w:t xml:space="preserve"> </w:t>
-            </w:r>
-            <m:oMath>
-              <m:r>
-                <m:rPr>
-                  <m:sty m:val="p"/>
-                </m:rPr>
-                <m:t>±</m:t>
-              </m:r>
-            </m:oMath>
-            <w:r>
-              <w:t xml:space="preserve"> </w:t>
-            </w:r>
-            <w:r>
-              <w:t xml:space="preserve">0.016</w:t>
-            </w:r>
-          </w:p>
-        </w:tc>
-      </w:tr>
-      <w:tr>
-        <w:tc>
-          <w:tcPr/>
-          <w:p>
-            <w:pPr>
-              <w:pStyle w:val="Compact"/>
-              <w:jc w:val="left"/>
-            </w:pPr>
-            <w:r>
-              <w:t xml:space="preserve">Last lumbar (L5, L6)</w:t>
-            </w:r>
-          </w:p>
-        </w:tc>
-        <w:tc>
-          <w:tcPr/>
-          <w:p>
-            <w:pPr>
-              <w:pStyle w:val="Compact"/>
-              <w:jc w:val="center"/>
-            </w:pPr>
-            <w:r>
-              <w:t xml:space="preserve">0.957</w:t>
-            </w:r>
-            <w:r>
-              <w:t xml:space="preserve"> </w:t>
-            </w:r>
-            <m:oMath>
-              <m:r>
-                <m:rPr>
-                  <m:sty m:val="p"/>
-                </m:rPr>
-                <m:t>±</m:t>
-              </m:r>
-            </m:oMath>
-            <w:r>
-              <w:t xml:space="preserve"> </w:t>
-            </w:r>
-            <w:r>
-              <w:t xml:space="preserve">0.016</w:t>
             </w:r>
           </w:p>
         </w:tc>

</xml_diff>

<commit_message>
Ribs: the rib-vertebra incidence at three stages, raw, after review, and release
Co-Authored-By: Claude Fable 5.1 <noreply@anthropic.com>
</commit_message>
<xml_diff>
--- a/paper/mpda/CTSpinoPelvic1K_single_column.docx
+++ b/paper/mpda/CTSpinoPelvic1K_single_column.docx
@@ -1408,7 +1408,7 @@
     <w:bookmarkEnd w:id="9"/>
     <w:bookmarkEnd w:id="10"/>
     <w:bookmarkEnd w:id="11"/>
-    <w:bookmarkStart w:id="37" w:name="acquisition-and-validation-methods"/>
+    <w:bookmarkStart w:id="38" w:name="acquisition-and-validation-methods"/>
     <w:p>
       <w:pPr>
         <w:pStyle w:val="Heading1"/>
@@ -2441,7 +2441,7 @@
     </w:tbl>
     <w:bookmarkEnd w:id="14"/>
     <w:bookmarkEnd w:id="15"/>
-    <w:bookmarkStart w:id="16" w:name="ribs"/>
+    <w:bookmarkStart w:id="17" w:name="ribs"/>
     <w:p>
       <w:pPr>
         <w:pStyle w:val="Heading2"/>
@@ -2613,52 +2613,70 @@
         <w:pStyle w:val="BodyText"/>
       </w:pPr>
       <w:r>
-        <w:t xml:space="preserve">The result is a pseudolabel whose review was triaged rather than exhaustive. A label-based</w:t>
-      </w:r>
-      <w:r>
-        <w:t xml:space="preserve"> </w:t>
-      </w:r>
-      <w:r>
-        <w:t xml:space="preserve">rule flagged every record in which one rib</w:t>
-      </w:r>
-      <w:r>
-        <w:t xml:space="preserve"> </w:t>
-      </w:r>
-      <w:r>
-        <w:t xml:space="preserve">bone carried more than one identifier, or in which a rib failed to reach the vertebra it</w:t>
-      </w:r>
-      <w:r>
-        <w:t xml:space="preserve"> </w:t>
-      </w:r>
-      <w:r>
-        <w:t xml:space="preserve">articulates with, since a single bone carrying two numbers is a numbering error whatever the anatomy. The</w:t>
-      </w:r>
-      <w:r>
-        <w:t xml:space="preserve"> </w:t>
-      </w:r>
-      <w:r>
-        <w:t xml:space="preserve">rule selected 152 records; 148 were reviewed and corrected, and four</w:t>
-      </w:r>
-      <w:r>
-        <w:t xml:space="preserve"> </w:t>
-      </w:r>
-      <w:r>
-        <w:t xml:space="preserve">were not and are identified in the release. Reviewers were medical students working through  </w:t>
-      </w:r>
-      <w:r>
-        <w:t xml:space="preserve">, trained against</w:t>
-      </w:r>
-      <w:r>
-        <w:t xml:space="preserve"> </w:t>
-      </w:r>
-      <w:r>
-        <w:t xml:space="preserve">a written labeling protocol, with every correction attributed to its annotator. Records passing the rule were not individually inspected;</w:t>
-      </w:r>
-      <w:r>
-        <w:t xml:space="preserve"> </w:t>
-      </w:r>
-      <w:r>
-        <w:t xml:space="preserve">the residual rib–vertebra offsets reported in Sec. </w:t>
+        <w:t xml:space="preserve">The result of their union is a pseudolabel of all ribs in the volume. An extensive quality</w:t>
+      </w:r>
+      <w:r>
+        <w:t xml:space="preserve"> </w:t>
+      </w:r>
+      <w:r>
+        <w:t xml:space="preserve">control pipeline was used to triage possible errors rather than exhaustively reviewing all the</w:t>
+      </w:r>
+      <w:r>
+        <w:t xml:space="preserve"> </w:t>
+      </w:r>
+      <w:r>
+        <w:t xml:space="preserve">pseudolabels. A label-based rule flagged every record in which one rib bone carried more than</w:t>
+      </w:r>
+      <w:r>
+        <w:t xml:space="preserve"> </w:t>
+      </w:r>
+      <w:r>
+        <w:t xml:space="preserve">one identifier, or in which a rib failed to reach the vertebra it articulates with, since a</w:t>
+      </w:r>
+      <w:r>
+        <w:t xml:space="preserve"> </w:t>
+      </w:r>
+      <w:r>
+        <w:t xml:space="preserve">single bone carrying two numbers is a numbering error whatever the anatomy. On the raw union</w:t>
+      </w:r>
+      <w:r>
+        <w:t xml:space="preserve"> </w:t>
+      </w:r>
+      <w:r>
+        <w:t xml:space="preserve">the rule selected 152 records, with 584 rib bones carrying two identifiers among them; 148</w:t>
+      </w:r>
+      <w:r>
+        <w:t xml:space="preserve"> </w:t>
+      </w:r>
+      <w:r>
+        <w:t xml:space="preserve">were reviewed and corrected, and four were not and are identified in the release. Reviewers</w:t>
+      </w:r>
+      <w:r>
+        <w:t xml:space="preserve"> </w:t>
+      </w:r>
+      <w:r>
+        <w:t xml:space="preserve">were medical students working through  </w:t>
+      </w:r>
+      <w:r>
+        <w:t xml:space="preserve">, trained against a written</w:t>
+      </w:r>
+      <w:r>
+        <w:t xml:space="preserve"> </w:t>
+      </w:r>
+      <w:r>
+        <w:t xml:space="preserve">labeling protocol, with every correction attributed to its annotator. Records passing the rule</w:t>
+      </w:r>
+      <w:r>
+        <w:t xml:space="preserve"> </w:t>
+      </w:r>
+      <w:r>
+        <w:t xml:space="preserve">were not individually inspected; the rib–vertebra incidence check of</w:t>
+      </w:r>
+      <w:r>
+        <w:t xml:space="preserve"> </w:t>
+      </w:r>
+      <w:r>
+        <w:t xml:space="preserve">Sec. </w:t>
       </w:r>
       <w:hyperlink w:anchor="sec:validation">
         <w:r>
@@ -2669,20 +2687,382 @@
         </w:r>
       </w:hyperlink>
       <w:r>
-        <w:t xml:space="preserve"> </w:t>
-      </w:r>
-      <w:r>
-        <w:t xml:space="preserve">are the</w:t>
-      </w:r>
-      <w:r>
-        <w:t xml:space="preserve"> </w:t>
-      </w:r>
-      <w:r>
-        <w:t xml:space="preserve">independent check on what the rule missed.</w:t>
-      </w:r>
-    </w:p>
+        <w:t xml:space="preserve">, run at each stage, is the independent measure of what the rule and</w:t>
+      </w:r>
+      <w:r>
+        <w:t xml:space="preserve"> </w:t>
+      </w:r>
+      <w:r>
+        <w:t xml:space="preserve">the reviewers missed (Table </w:t>
+      </w:r>
+      <w:hyperlink w:anchor="tab:ribqc">
+        <w:r>
+          <w:rPr>
+            <w:rStyle w:val="Hyperlink"/>
+          </w:rPr>
+          <w:t xml:space="preserve">3</w:t>
+        </w:r>
+      </w:hyperlink>
+      <w:r>
+        <w:t xml:space="preserve">). On the raw pseudolabel 3.1% of the evaluable</w:t>
+      </w:r>
+      <w:r>
+        <w:t xml:space="preserve"> </w:t>
+      </w:r>
+      <w:r>
+        <w:t xml:space="preserve">ribs sat one or two levels from the vertebra their number implies and 24 records carried a</w:t>
+      </w:r>
+      <w:r>
+        <w:t xml:space="preserve"> </w:t>
+      </w:r>
+      <w:r>
+        <w:t xml:space="preserve">misnumbered cage; the students’ corrections cut both by a third (1.9%, 16 records). What</w:t>
+      </w:r>
+      <w:r>
+        <w:t xml:space="preserve"> </w:t>
+      </w:r>
+      <w:r>
+        <w:t xml:space="preserve">remained were whole-side shifts that no reviewer had been asked to look for: once a rib on a</w:t>
+      </w:r>
+      <w:r>
+        <w:t xml:space="preserve"> </w:t>
+      </w:r>
+      <w:r>
+        <w:t xml:space="preserve">lumbar body received its own class, each side could be anchored on its most confident</w:t>
+      </w:r>
+      <w:r>
+        <w:t xml:space="preserve"> </w:t>
+      </w:r>
+      <w:r>
+        <w:t xml:space="preserve">articulation and renumbered by counting, which left two offset ribs in 5</w:t>
+      </w:r>
+      <w:r>
+        <w:t xml:space="preserve">,</w:t>
+      </w:r>
+      <w:r>
+        <w:t xml:space="preserve">749 and no</w:t>
+      </w:r>
+      <w:r>
+        <w:t xml:space="preserve"> </w:t>
+      </w:r>
+      <w:r>
+        <w:t xml:space="preserve">misnumbered record.</w:t>
+      </w:r>
+    </w:p>
+    <w:bookmarkStart w:id="16" w:name="tab:ribqc"/>
+    <w:p>
+      <w:pPr>
+        <w:pStyle w:val="TableCaption"/>
+      </w:pPr>
+      <w:r>
+        <w:t xml:space="preserve">Rib–vertebra incidence at three stages: the raw union pseudolabel, after the</w:t>
+      </w:r>
+      <w:r>
+        <w:t xml:space="preserve"> </w:t>
+      </w:r>
+      <w:r>
+        <w:t xml:space="preserve">students corrected the 148 triaged records, and the release after the lumbar-rib class and</w:t>
+      </w:r>
+      <w:r>
+        <w:t xml:space="preserve"> </w:t>
+      </w:r>
+      <w:r>
+        <w:t xml:space="preserve">rule-based renumbering. Evaluable ribs are those whose expected vertebra lies in the field of</w:t>
+      </w:r>
+      <w:r>
+        <w:t xml:space="preserve"> </w:t>
+      </w:r>
+      <w:r>
+        <w:t xml:space="preserve">view; a record is misnumbered when its ribs are consistently offset.</w:t>
+      </w:r>
+    </w:p>
+    <w:tbl>
+      <w:tblPr>
+        <w:tblStyle w:val="Table"/>
+        <w:tblW w:type="auto" w:w="0"/>
+        <w:tblLook w:firstRow="1" w:lastRow="0" w:firstColumn="0" w:lastColumn="0" w:noHBand="0" w:noVBand="0" w:val="0020"/>
+        <w:tblCaption w:val="Rib–vertebra incidence at three stages: the raw union pseudolabel, after the students corrected the 148 triaged records, and the release after the lumbar-rib class and rule-based renumbering. Evaluable ribs are those whose expected vertebra lies in the field of view; a record is misnumbered when its ribs are consistently offset."/>
+      </w:tblPr>
+      <w:tblGrid>
+        <w:gridCol w:w="1584"/>
+        <w:gridCol w:w="1584"/>
+        <w:gridCol w:w="1584"/>
+        <w:gridCol w:w="1584"/>
+        <w:gridCol w:w="1584"/>
+      </w:tblGrid>
+      <w:tr>
+        <w:trPr>
+          <w:tblHeader w:val="on"/>
+        </w:trPr>
+        <w:tc>
+          <w:tcPr/>
+          <w:p>
+            <w:pPr>
+              <w:pStyle w:val="Compact"/>
+              <w:jc w:val="left"/>
+            </w:pPr>
+            <w:r>
+              <w:t xml:space="preserve">Stage</w:t>
+            </w:r>
+          </w:p>
+        </w:tc>
+        <w:tc>
+          <w:tcPr/>
+          <w:p>
+            <w:pPr>
+              <w:pStyle w:val="Compact"/>
+              <w:jc w:val="right"/>
+            </w:pPr>
+            <w:r>
+              <w:t xml:space="preserve">Evaluable ribs</w:t>
+            </w:r>
+          </w:p>
+        </w:tc>
+        <w:tc>
+          <w:tcPr/>
+          <w:p>
+            <w:pPr>
+              <w:pStyle w:val="Compact"/>
+              <w:jc w:val="right"/>
+            </w:pPr>
+            <w:r>
+              <w:t xml:space="preserve">On own vertebra</w:t>
+            </w:r>
+          </w:p>
+        </w:tc>
+        <w:tc>
+          <w:tcPr/>
+          <w:p>
+            <w:pPr>
+              <w:pStyle w:val="Compact"/>
+              <w:jc w:val="right"/>
+            </w:pPr>
+            <w:r>
+              <w:t xml:space="preserve">Offset</w:t>
+            </w:r>
+          </w:p>
+        </w:tc>
+        <w:tc>
+          <w:tcPr/>
+          <w:p>
+            <w:pPr>
+              <w:pStyle w:val="Compact"/>
+              <w:jc w:val="right"/>
+            </w:pPr>
+            <w:r>
+              <w:t xml:space="preserve">Misnumbered records</w:t>
+            </w:r>
+          </w:p>
+        </w:tc>
+      </w:tr>
+      <w:tr>
+        <w:tc>
+          <w:tcPr/>
+          <w:p>
+            <w:pPr>
+              <w:pStyle w:val="Compact"/>
+              <w:jc w:val="left"/>
+            </w:pPr>
+            <w:r>
+              <w:t xml:space="preserve">Raw pseudolabel</w:t>
+            </w:r>
+          </w:p>
+        </w:tc>
+        <w:tc>
+          <w:tcPr/>
+          <w:p>
+            <w:pPr>
+              <w:pStyle w:val="Compact"/>
+              <w:jc w:val="right"/>
+            </w:pPr>
+            <w:r>
+              <w:t xml:space="preserve">5</w:t>
+            </w:r>
+            <w:r>
+              <w:t xml:space="preserve">,</w:t>
+            </w:r>
+            <w:r>
+              <w:t xml:space="preserve">560</w:t>
+            </w:r>
+          </w:p>
+        </w:tc>
+        <w:tc>
+          <w:tcPr/>
+          <w:p>
+            <w:pPr>
+              <w:pStyle w:val="Compact"/>
+              <w:jc w:val="right"/>
+            </w:pPr>
+            <w:r>
+              <w:t xml:space="preserve">96.6%</w:t>
+            </w:r>
+          </w:p>
+        </w:tc>
+        <w:tc>
+          <w:tcPr/>
+          <w:p>
+            <w:pPr>
+              <w:pStyle w:val="Compact"/>
+              <w:jc w:val="right"/>
+            </w:pPr>
+            <w:r>
+              <w:t xml:space="preserve">170 (3.1%)</w:t>
+            </w:r>
+          </w:p>
+        </w:tc>
+        <w:tc>
+          <w:tcPr/>
+          <w:p>
+            <w:pPr>
+              <w:pStyle w:val="Compact"/>
+              <w:jc w:val="right"/>
+            </w:pPr>
+            <w:r>
+              <w:t xml:space="preserve">24</w:t>
+            </w:r>
+          </w:p>
+        </w:tc>
+      </w:tr>
+      <w:tr>
+        <w:tc>
+          <w:tcPr/>
+          <w:p>
+            <w:pPr>
+              <w:pStyle w:val="Compact"/>
+              <w:jc w:val="left"/>
+            </w:pPr>
+            <w:r>
+              <w:t xml:space="preserve">After student correction</w:t>
+            </w:r>
+          </w:p>
+        </w:tc>
+        <w:tc>
+          <w:tcPr/>
+          <w:p>
+            <w:pPr>
+              <w:pStyle w:val="Compact"/>
+              <w:jc w:val="right"/>
+            </w:pPr>
+            <w:r>
+              <w:t xml:space="preserve">5</w:t>
+            </w:r>
+            <w:r>
+              <w:t xml:space="preserve">,</w:t>
+            </w:r>
+            <w:r>
+              <w:t xml:space="preserve">670</w:t>
+            </w:r>
+          </w:p>
+        </w:tc>
+        <w:tc>
+          <w:tcPr/>
+          <w:p>
+            <w:pPr>
+              <w:pStyle w:val="Compact"/>
+              <w:jc w:val="right"/>
+            </w:pPr>
+            <w:r>
+              <w:t xml:space="preserve">97.6%</w:t>
+            </w:r>
+          </w:p>
+        </w:tc>
+        <w:tc>
+          <w:tcPr/>
+          <w:p>
+            <w:pPr>
+              <w:pStyle w:val="Compact"/>
+              <w:jc w:val="right"/>
+            </w:pPr>
+            <w:r>
+              <w:t xml:space="preserve">109 (1.9%)</w:t>
+            </w:r>
+          </w:p>
+        </w:tc>
+        <w:tc>
+          <w:tcPr/>
+          <w:p>
+            <w:pPr>
+              <w:pStyle w:val="Compact"/>
+              <w:jc w:val="right"/>
+            </w:pPr>
+            <w:r>
+              <w:t xml:space="preserve">16</w:t>
+            </w:r>
+          </w:p>
+        </w:tc>
+      </w:tr>
+      <w:tr>
+        <w:tc>
+          <w:tcPr/>
+          <w:p>
+            <w:pPr>
+              <w:pStyle w:val="Compact"/>
+              <w:jc w:val="left"/>
+            </w:pPr>
+            <w:r>
+              <w:t xml:space="preserve">Release</w:t>
+            </w:r>
+          </w:p>
+        </w:tc>
+        <w:tc>
+          <w:tcPr/>
+          <w:p>
+            <w:pPr>
+              <w:pStyle w:val="Compact"/>
+              <w:jc w:val="right"/>
+            </w:pPr>
+            <w:r>
+              <w:t xml:space="preserve">5</w:t>
+            </w:r>
+            <w:r>
+              <w:t xml:space="preserve">,</w:t>
+            </w:r>
+            <w:r>
+              <w:t xml:space="preserve">749</w:t>
+            </w:r>
+          </w:p>
+        </w:tc>
+        <w:tc>
+          <w:tcPr/>
+          <w:p>
+            <w:pPr>
+              <w:pStyle w:val="Compact"/>
+              <w:jc w:val="right"/>
+            </w:pPr>
+            <w:r>
+              <w:t xml:space="preserve">99.97%</w:t>
+            </w:r>
+          </w:p>
+        </w:tc>
+        <w:tc>
+          <w:tcPr/>
+          <w:p>
+            <w:pPr>
+              <w:pStyle w:val="Compact"/>
+              <w:jc w:val="right"/>
+            </w:pPr>
+            <w:r>
+              <w:t xml:space="preserve">2 (0.035%)</w:t>
+            </w:r>
+          </w:p>
+        </w:tc>
+        <w:tc>
+          <w:tcPr/>
+          <w:p>
+            <w:pPr>
+              <w:pStyle w:val="Compact"/>
+              <w:jc w:val="right"/>
+            </w:pPr>
+            <w:r>
+              <w:t xml:space="preserve">0</w:t>
+            </w:r>
+          </w:p>
+        </w:tc>
+      </w:tr>
+    </w:tbl>
     <w:bookmarkEnd w:id="16"/>
-    <w:bookmarkStart w:id="21" w:name="sec:anchors"/>
+    <w:bookmarkEnd w:id="17"/>
+    <w:bookmarkStart w:id="22" w:name="sec:anchors"/>
     <w:p>
       <w:pPr>
         <w:pStyle w:val="Heading2"/>
@@ -3027,7 +3407,7 @@
         <w:t xml:space="preserve">read.</w:t>
       </w:r>
     </w:p>
-    <w:bookmarkStart w:id="20" w:name="fig:anchors"/>
+    <w:bookmarkStart w:id="21" w:name="fig:anchors"/>
     <w:p>
       <w:pPr>
         <w:pStyle w:val="CaptionedFigure"/>
@@ -3037,18 +3417,18 @@
           <wp:inline>
             <wp:extent cx="5334000" cy="1345176"/>
             <wp:effectExtent b="0" l="0" r="0" t="0"/>
-            <wp:docPr descr="" title="" id="18" name="Picture"/>
+            <wp:docPr descr="" title="" id="19" name="Picture"/>
             <a:graphic>
               <a:graphicData uri="http://schemas.openxmlformats.org/drawingml/2006/picture">
                 <pic:pic>
                   <pic:nvPicPr>
-                    <pic:cNvPr descr="figures/fig_anchors.pdf" id="19" name="Picture"/>
+                    <pic:cNvPr descr="figures/fig_anchors.pdf" id="20" name="Picture"/>
                     <pic:cNvPicPr>
                       <a:picLocks noChangeArrowheads="1" noChangeAspect="1"/>
                     </pic:cNvPicPr>
                   </pic:nvPicPr>
                   <pic:blipFill>
-                    <a:blip r:embed="rId17"/>
+                    <a:blip r:embed="rId18"/>
                     <a:stretch>
                       <a:fillRect/>
                     </a:stretch>
@@ -3089,7 +3469,7 @@
         <w:t xml:space="preserve">yellow, rib-free vertebrae between. Cases 0704, 0428, 0094, 0005, chosen by rule. (b) and (c) share one upper border, a short rib pair under a full pair; (b) has no LSTV; (c) is Castellvi IIIb, its fifth lumbar segment fused to the sacrum.</w:t>
       </w:r>
     </w:p>
-    <w:bookmarkEnd w:id="20"/>
+    <w:bookmarkEnd w:id="21"/>
     <w:p>
       <w:pPr>
         <w:pStyle w:val="BodyText"/>
@@ -3193,8 +3573,8 @@
         <w:t xml:space="preserve">computed from the released label volumes by counting identifiers 25 and 60–61.</w:t>
       </w:r>
     </w:p>
-    <w:bookmarkEnd w:id="21"/>
-    <w:bookmarkStart w:id="25" w:name="sec:tools"/>
+    <w:bookmarkEnd w:id="22"/>
+    <w:bookmarkStart w:id="26" w:name="sec:tools"/>
     <w:p>
       <w:pPr>
         <w:pStyle w:val="Heading2"/>
@@ -3325,7 +3705,7 @@
       <w:r>
         <w:t xml:space="preserve">data (</w:t>
       </w:r>
-      <w:hyperlink r:id="rId22">
+      <w:hyperlink r:id="rId23">
         <w:r>
           <w:rPr>
             <w:rStyle w:val="Hyperlink"/>
@@ -3339,7 +3719,7 @@
       <w:r>
         <w:t xml:space="preserve"> </w:t>
       </w:r>
-      <w:hyperlink r:id="rId23">
+      <w:hyperlink r:id="rId24">
         <w:r>
           <w:rPr>
             <w:rStyle w:val="Hyperlink"/>
@@ -3436,7 +3816,7 @@
       <w:r>
         <w:t xml:space="preserve">(</w:t>
       </w:r>
-      <w:hyperlink r:id="rId24">
+      <w:hyperlink r:id="rId25">
         <w:r>
           <w:rPr>
             <w:rStyle w:val="Hyperlink"/>
@@ -3502,8 +3882,8 @@
         <w:t xml:space="preserve">released volumes. All content was independently reviewed, verified, and interpreted by the authors.</w:t>
       </w:r>
     </w:p>
-    <w:bookmarkEnd w:id="25"/>
-    <w:bookmarkStart w:id="26" w:name="sec:validation"/>
+    <w:bookmarkEnd w:id="26"/>
+    <w:bookmarkStart w:id="27" w:name="sec:validation"/>
     <w:p>
       <w:pPr>
         <w:pStyle w:val="Heading2"/>
@@ -3902,8 +4282,8 @@
         <w:t xml:space="preserve">rather than lowering it, so the residual tracks cohort and not construction.</w:t>
       </w:r>
     </w:p>
-    <w:bookmarkEnd w:id="26"/>
-    <w:bookmarkStart w:id="28" w:name="castellvi-typing"/>
+    <w:bookmarkEnd w:id="27"/>
+    <w:bookmarkStart w:id="29" w:name="castellvi-typing"/>
     <w:p>
       <w:pPr>
         <w:pStyle w:val="Heading2"/>
@@ -4008,7 +4388,7 @@
         <w:t xml:space="preserve">disagreements were III against II.</w:t>
       </w:r>
     </w:p>
-    <w:bookmarkStart w:id="27" w:name="tab:spinopelvic"/>
+    <w:bookmarkStart w:id="28" w:name="tab:spinopelvic"/>
     <w:p>
       <w:pPr>
         <w:pStyle w:val="TableCaption"/>
@@ -4688,9 +5068,9 @@
         </w:tc>
       </w:tr>
     </w:tbl>
-    <w:bookmarkEnd w:id="27"/>
     <w:bookmarkEnd w:id="28"/>
-    <w:bookmarkStart w:id="36" w:name="sec:hardware"/>
+    <w:bookmarkEnd w:id="29"/>
+    <w:bookmarkStart w:id="37" w:name="sec:hardware"/>
     <w:p>
       <w:pPr>
         <w:pStyle w:val="Heading2"/>
@@ -4738,7 +5118,7 @@
         <w:t xml:space="preserve">vertebra does.</w:t>
       </w:r>
     </w:p>
-    <w:bookmarkStart w:id="29" w:name="X6ccedf8a194116531bb518b375b53d9e1e007e9"/>
+    <w:bookmarkStart w:id="30" w:name="X6ccedf8a194116531bb518b375b53d9e1e007e9"/>
     <w:p>
       <w:pPr>
         <w:pStyle w:val="Heading4"/>
@@ -4825,8 +5205,8 @@
         <w:t xml:space="preserve">or below.</w:t>
       </w:r>
     </w:p>
-    <w:bookmarkEnd w:id="29"/>
-    <w:bookmarkStart w:id="30" w:name="the-subtype-block-had-to-be-extended."/>
+    <w:bookmarkEnd w:id="30"/>
+    <w:bookmarkStart w:id="31" w:name="the-subtype-block-had-to-be-extended."/>
     <w:p>
       <w:pPr>
         <w:pStyle w:val="Heading4"/>
@@ -4917,8 +5297,8 @@
         <w:t xml:space="preserve">).</w:t>
       </w:r>
     </w:p>
-    <w:bookmarkEnd w:id="30"/>
-    <w:bookmarkStart w:id="35" w:name="X06fc12f192e95ab0f7b26779051c84afa05042a"/>
+    <w:bookmarkEnd w:id="31"/>
+    <w:bookmarkStart w:id="36" w:name="X06fc12f192e95ab0f7b26779051c84afa05042a"/>
     <w:p>
       <w:pPr>
         <w:pStyle w:val="Heading4"/>
@@ -4953,7 +5333,7 @@
         <w:t xml:space="preserve">measured from is an implant.</w:t>
       </w:r>
     </w:p>
-    <w:bookmarkStart w:id="34" w:name="fig:hardware"/>
+    <w:bookmarkStart w:id="35" w:name="fig:hardware"/>
     <w:p>
       <w:pPr>
         <w:pStyle w:val="CaptionedFigure"/>
@@ -4963,18 +5343,18 @@
           <wp:inline>
             <wp:extent cx="5334000" cy="1144542"/>
             <wp:effectExtent b="0" l="0" r="0" t="0"/>
-            <wp:docPr descr="" title="" id="32" name="Picture"/>
+            <wp:docPr descr="" title="" id="33" name="Picture"/>
             <a:graphic>
               <a:graphicData uri="http://schemas.openxmlformats.org/drawingml/2006/picture">
                 <pic:pic>
                   <pic:nvPicPr>
-                    <pic:cNvPr descr="figures/fig_hardware.pdf" id="33" name="Picture"/>
+                    <pic:cNvPr descr="figures/fig_hardware.pdf" id="34" name="Picture"/>
                     <pic:cNvPicPr>
                       <a:picLocks noChangeArrowheads="1" noChangeAspect="1"/>
                     </pic:cNvPicPr>
                   </pic:nvPicPr>
                   <pic:blipFill>
-                    <a:blip r:embed="rId31"/>
+                    <a:blip r:embed="rId32"/>
                     <a:stretch>
                       <a:fillRect/>
                     </a:stretch>
@@ -5089,11 +5469,11 @@
         <w:t xml:space="preserve">. Bar, 5 cm.</w:t>
       </w:r>
     </w:p>
-    <w:bookmarkEnd w:id="34"/>
     <w:bookmarkEnd w:id="35"/>
     <w:bookmarkEnd w:id="36"/>
     <w:bookmarkEnd w:id="37"/>
-    <w:bookmarkStart w:id="39" w:name="sec:format"/>
+    <w:bookmarkEnd w:id="38"/>
+    <w:bookmarkStart w:id="40" w:name="sec:format"/>
     <w:p>
       <w:pPr>
         <w:pStyle w:val="Heading1"/>
@@ -5249,7 +5629,7 @@
         <w:t xml:space="preserve">own decimal places.</w:t>
       </w:r>
     </w:p>
-    <w:bookmarkStart w:id="38" w:name="tab:completeness"/>
+    <w:bookmarkStart w:id="39" w:name="tab:completeness"/>
     <w:p>
       <w:pPr>
         <w:pStyle w:val="TableCaption"/>
@@ -5660,7 +6040,7 @@
         </w:tc>
       </w:tr>
     </w:tbl>
-    <w:bookmarkEnd w:id="38"/>
+    <w:bookmarkEnd w:id="39"/>
     <w:p>
       <w:pPr>
         <w:pStyle w:val="BodyText"/>
@@ -5675,8 +6055,8 @@
         <w:t xml:space="preserve">the tagged release commit; any model-hub copy is a convenience mirror, not the archive.</w:t>
       </w:r>
     </w:p>
-    <w:bookmarkEnd w:id="39"/>
-    <w:bookmarkStart w:id="44" w:name="sec:descriptive"/>
+    <w:bookmarkEnd w:id="40"/>
+    <w:bookmarkStart w:id="45" w:name="sec:descriptive"/>
     <w:p>
       <w:pPr>
         <w:pStyle w:val="Heading1"/>
@@ -5831,7 +6211,7 @@
           <w:rPr>
             <w:rStyle w:val="Hyperlink"/>
           </w:rPr>
-          <w:t xml:space="preserve">3</w:t>
+          <w:t xml:space="preserve">4</w:t>
         </w:r>
       </w:hyperlink>
       <w:r>
@@ -5841,7 +6221,7 @@
         <w:t xml:space="preserve">places against two series.</w:t>
       </w:r>
     </w:p>
-    <w:bookmarkStart w:id="43" w:name="fig:validation"/>
+    <w:bookmarkStart w:id="44" w:name="fig:validation"/>
     <w:p>
       <w:pPr>
         <w:pStyle w:val="CaptionedFigure"/>
@@ -5851,18 +6231,18 @@
           <wp:inline>
             <wp:extent cx="5334000" cy="1104674"/>
             <wp:effectExtent b="0" l="0" r="0" t="0"/>
-            <wp:docPr descr="" title="" id="41" name="Picture"/>
+            <wp:docPr descr="" title="" id="42" name="Picture"/>
             <a:graphic>
               <a:graphicData uri="http://schemas.openxmlformats.org/drawingml/2006/picture">
                 <pic:pic>
                   <pic:nvPicPr>
-                    <pic:cNvPr descr="figures/fig_validation.pdf" id="42" name="Picture"/>
+                    <pic:cNvPr descr="figures/fig_validation.pdf" id="43" name="Picture"/>
                     <pic:cNvPicPr>
                       <a:picLocks noChangeArrowheads="1" noChangeAspect="1"/>
                     </pic:cNvPicPr>
                   </pic:nvPicPr>
                   <pic:blipFill>
-                    <a:blip r:embed="rId40"/>
+                    <a:blip r:embed="rId41"/>
                     <a:stretch>
                       <a:fillRect/>
                     </a:stretch>
@@ -5917,7 +6297,7 @@
         <w:t xml:space="preserve">.</w:t>
       </w:r>
     </w:p>
-    <w:bookmarkEnd w:id="43"/>
+    <w:bookmarkEnd w:id="44"/>
     <w:p>
       <w:pPr>
         <w:pStyle w:val="BodyText"/>
@@ -5954,8 +6334,8 @@
         <w:t xml:space="preserve">reported at the published standard site.</w:t>
       </w:r>
     </w:p>
-    <w:bookmarkEnd w:id="44"/>
-    <w:bookmarkStart w:id="55" w:name="sec:applications"/>
+    <w:bookmarkEnd w:id="45"/>
+    <w:bookmarkStart w:id="56" w:name="sec:applications"/>
     <w:p>
       <w:pPr>
         <w:pStyle w:val="Heading1"/>
@@ -6077,7 +6457,7 @@
         <w:t xml:space="preserve">decision.</w:t>
       </w:r>
     </w:p>
-    <w:bookmarkStart w:id="54" w:name="X1e405bcd3081b4ebb91076491188f6b710d9489"/>
+    <w:bookmarkStart w:id="55" w:name="X1e405bcd3081b4ebb91076491188f6b710d9489"/>
     <w:p>
       <w:pPr>
         <w:pStyle w:val="Heading2"/>
@@ -6146,7 +6526,7 @@
         <w:t xml:space="preserve">enumeration, a model trained on them is not learning the convention that fails.</w:t>
       </w:r>
     </w:p>
-    <w:bookmarkStart w:id="48" w:name="fig:levelatlas"/>
+    <w:bookmarkStart w:id="49" w:name="fig:levelatlas"/>
     <w:p>
       <w:pPr>
         <w:pStyle w:val="CaptionedFigure"/>
@@ -6156,18 +6536,18 @@
           <wp:inline>
             <wp:extent cx="5334000" cy="1190055"/>
             <wp:effectExtent b="0" l="0" r="0" t="0"/>
-            <wp:docPr descr="" title="" id="46" name="Picture"/>
+            <wp:docPr descr="" title="" id="47" name="Picture"/>
             <a:graphic>
               <a:graphicData uri="http://schemas.openxmlformats.org/drawingml/2006/picture">
                 <pic:pic>
                   <pic:nvPicPr>
-                    <pic:cNvPr descr="figures/fig_levelatlas.pdf" id="47" name="Picture"/>
+                    <pic:cNvPr descr="figures/fig_levelatlas.pdf" id="48" name="Picture"/>
                     <pic:cNvPicPr>
                       <a:picLocks noChangeArrowheads="1" noChangeAspect="1"/>
                     </pic:cNvPicPr>
                   </pic:nvPicPr>
                   <pic:blipFill>
-                    <a:blip r:embed="rId45"/>
+                    <a:blip r:embed="rId46"/>
                     <a:stretch>
                       <a:fillRect/>
                     </a:stretch>
@@ -6243,7 +6623,7 @@
         <w:t xml:space="preserve">SD recovered from the reported SEM; T11–T12 EPWu is digitised from his Figure 4A.</w:t>
       </w:r>
     </w:p>
-    <w:bookmarkEnd w:id="48"/>
+    <w:bookmarkEnd w:id="49"/>
     <w:p>
       <w:pPr>
         <w:pStyle w:val="BodyText"/>
@@ -6426,7 +6806,7 @@
         <w:t xml:space="preserve">postural change to check a prediction against.</w:t>
       </w:r>
     </w:p>
-    <w:bookmarkStart w:id="52" w:name="fig:fov"/>
+    <w:bookmarkStart w:id="53" w:name="fig:fov"/>
     <w:p>
       <w:pPr>
         <w:pStyle w:val="CaptionedFigure"/>
@@ -6436,18 +6816,18 @@
           <wp:inline>
             <wp:extent cx="2895600" cy="927100"/>
             <wp:effectExtent b="0" l="0" r="0" t="0"/>
-            <wp:docPr descr="" title="" id="50" name="Picture"/>
+            <wp:docPr descr="" title="" id="51" name="Picture"/>
             <a:graphic>
               <a:graphicData uri="http://schemas.openxmlformats.org/drawingml/2006/picture">
                 <pic:pic>
                   <pic:nvPicPr>
-                    <pic:cNvPr descr="figures/fig_fov.pdf" id="51" name="Picture"/>
+                    <pic:cNvPr descr="figures/fig_fov.pdf" id="52" name="Picture"/>
                     <pic:cNvPicPr>
                       <a:picLocks noChangeArrowheads="1" noChangeAspect="1"/>
                     </pic:cNvPicPr>
                   </pic:nvPicPr>
                   <pic:blipFill>
-                    <a:blip r:embed="rId49"/>
+                    <a:blip r:embed="rId50"/>
                     <a:stretch>
                       <a:fillRect/>
                     </a:stretch>
@@ -6488,7 +6868,7 @@
         <w:t xml:space="preserve">in Table S1.</w:t>
       </w:r>
     </w:p>
-    <w:bookmarkEnd w:id="52"/>
+    <w:bookmarkEnd w:id="53"/>
     <w:p>
       <w:pPr>
         <w:pStyle w:val="BodyText"/>
@@ -6500,8 +6880,8 @@
         </w:rPr>
         <w:t xml:space="preserve">Limitations: coverage and cohort.</w:t>
       </w:r>
-      <w:bookmarkStart w:id="53" w:name="sec:limitations"/>
-      <w:bookmarkEnd w:id="53"/>
+      <w:bookmarkStart w:id="54" w:name="sec:limitations"/>
+      <w:bookmarkEnd w:id="54"/>
       <w:r>
         <w:t xml:space="preserve"> </w:t>
       </w:r>
@@ -6646,9 +7026,9 @@
         <w:t xml:space="preserve">Sacrum, hips and femora are present in all 802 records; one lacks T12, outside the field of view. Nine carry no L5 identifier because their source annotation counted four lumbar vertebrae; all nine are Castellvi IIIb, the fused segment is delineated with the sacrum as the caudal anchor, and the manifest names them. No shape-based classifier is attempted at the lumbosacral junction: 15 records in each rare stratum leave three per fold. The 0.990 area under the curve above is the thoracolumbar boundary, not this one.</w:t>
       </w:r>
     </w:p>
-    <w:bookmarkEnd w:id="54"/>
     <w:bookmarkEnd w:id="55"/>
-    <w:bookmarkStart w:id="56" w:name="discussion"/>
+    <w:bookmarkEnd w:id="56"/>
+    <w:bookmarkStart w:id="57" w:name="discussion"/>
     <w:p>
       <w:pPr>
         <w:pStyle w:val="Heading1"/>
@@ -6771,8 +7151,8 @@
         <w:t xml:space="preserve">L5 here.</w:t>
       </w:r>
     </w:p>
-    <w:bookmarkEnd w:id="56"/>
-    <w:bookmarkStart w:id="57" w:name="conclusion"/>
+    <w:bookmarkEnd w:id="57"/>
+    <w:bookmarkStart w:id="58" w:name="conclusion"/>
     <w:p>
       <w:pPr>
         <w:pStyle w:val="Heading1"/>
@@ -6819,8 +7199,8 @@
         <w:t xml:space="preserve">that cannot support the conventional count downward from C2.</w:t>
       </w:r>
     </w:p>
-    <w:bookmarkEnd w:id="57"/>
-    <w:bookmarkStart w:id="60" w:name="data-availability"/>
+    <w:bookmarkEnd w:id="58"/>
+    <w:bookmarkStart w:id="61" w:name="data-availability"/>
     <w:p>
       <w:pPr>
         <w:pStyle w:val="Heading1"/>
@@ -6886,7 +7266,7 @@
       <w:r>
         <w:t xml:space="preserve"> </w:t>
       </w:r>
-      <w:hyperlink r:id="rId58">
+      <w:hyperlink r:id="rId59">
         <w:r>
           <w:rPr>
             <w:rStyle w:val="Hyperlink"/>
@@ -6915,7 +7295,7 @@
       <w:r>
         <w:t xml:space="preserve"> </w:t>
       </w:r>
-      <w:hyperlink r:id="rId59">
+      <w:hyperlink r:id="rId60">
         <w:r>
           <w:rPr>
             <w:rStyle w:val="Hyperlink"/>
@@ -6935,7 +7315,7 @@
       <w:r>
         <w:t xml:space="preserve"> </w:t>
       </w:r>
-      <w:hyperlink r:id="rId24">
+      <w:hyperlink r:id="rId25">
         <w:r>
           <w:rPr>
             <w:rStyle w:val="Hyperlink"/>
@@ -6947,8 +7327,8 @@
         <w:t xml:space="preserve">.</w:t>
       </w:r>
     </w:p>
-    <w:bookmarkEnd w:id="60"/>
-    <w:bookmarkStart w:id="61" w:name="acknowledgements"/>
+    <w:bookmarkEnd w:id="61"/>
+    <w:bookmarkStart w:id="62" w:name="acknowledgements"/>
     <w:p>
       <w:pPr>
         <w:pStyle w:val="Heading1"/>
@@ -6971,8 +7351,8 @@
         <w:t xml:space="preserve">policy. This work received no funding.</w:t>
       </w:r>
     </w:p>
-    <w:bookmarkEnd w:id="61"/>
-    <w:bookmarkStart w:id="62" w:name="conflict-of-interest"/>
+    <w:bookmarkEnd w:id="62"/>
+    <w:bookmarkStart w:id="63" w:name="conflict-of-interest"/>
     <w:p>
       <w:pPr>
         <w:pStyle w:val="Heading1"/>
@@ -6989,8 +7369,8 @@
         <w:t xml:space="preserve">The authors have no relevant conflicts of interest to disclose.</w:t>
       </w:r>
     </w:p>
-    <w:bookmarkEnd w:id="62"/>
-    <w:bookmarkStart w:id="66" w:name="ethics"/>
+    <w:bookmarkEnd w:id="63"/>
+    <w:bookmarkStart w:id="67" w:name="ethics"/>
     <w:p>
       <w:pPr>
         <w:pStyle w:val="Heading1"/>
@@ -7897,7 +8277,7 @@
       <w:r>
         <w:t xml:space="preserve"> </w:t>
       </w:r>
-      <w:hyperlink r:id="rId63">
+      <w:hyperlink r:id="rId64">
         <w:r>
           <w:rPr>
             <w:rStyle w:val="Hyperlink"/>
@@ -7970,7 +8350,7 @@
       <w:r>
         <w:t xml:space="preserve"> </w:t>
       </w:r>
-      <w:hyperlink r:id="rId64">
+      <w:hyperlink r:id="rId65">
         <w:r>
           <w:rPr>
             <w:rStyle w:val="Hyperlink"/>
@@ -8058,7 +8438,7 @@
       <w:r>
         <w:t xml:space="preserve"> </w:t>
       </w:r>
-      <w:hyperlink r:id="rId65">
+      <w:hyperlink r:id="rId66">
         <w:r>
           <w:rPr>
             <w:rStyle w:val="Hyperlink"/>
@@ -9312,8 +9692,8 @@
         <w:t xml:space="preserve">doi:10.3390/jcm15072584.</w:t>
       </w:r>
     </w:p>
-    <w:bookmarkEnd w:id="66"/>
-    <w:bookmarkStart w:id="67" w:name="figure-captions"/>
+    <w:bookmarkEnd w:id="67"/>
+    <w:bookmarkStart w:id="68" w:name="figure-captions"/>
     <w:p>
       <w:pPr>
         <w:pStyle w:val="Heading1"/>
@@ -9561,7 +9941,7 @@
         <w:t xml:space="preserve">Records carrying each vertebral level, cranial to caudal. Counts per identifier in Table S1.</w:t>
       </w:r>
     </w:p>
-    <w:bookmarkEnd w:id="67"/>
+    <w:bookmarkEnd w:id="68"/>
     <w:sectPr>
       <w:footnotePr>
         <w:numRestart w:val="eachSect"/>

</xml_diff>

<commit_message>
Rib QC table fits its column
Co-Authored-By: Claude Fable 5.1 <noreply@anthropic.com>
</commit_message>
<xml_diff>
--- a/paper/mpda/CTSpinoPelvic1K_single_column.docx
+++ b/paper/mpda/CTSpinoPelvic1K_single_column.docx
@@ -2773,7 +2773,13 @@
         <w:t xml:space="preserve"> </w:t>
       </w:r>
       <w:r>
-        <w:t xml:space="preserve">view; a record is misnumbered when its ribs are consistently offset.</w:t>
+        <w:t xml:space="preserve">view; offset, one or two levels from the vertebra the number implies; misnumbered, records whose</w:t>
+      </w:r>
+      <w:r>
+        <w:t xml:space="preserve"> </w:t>
+      </w:r>
+      <w:r>
+        <w:t xml:space="preserve">ribs are consistently offset.</w:t>
       </w:r>
     </w:p>
     <w:tbl>
@@ -2781,7 +2787,7 @@
         <w:tblStyle w:val="Table"/>
         <w:tblW w:type="auto" w:w="0"/>
         <w:tblLook w:firstRow="1" w:lastRow="0" w:firstColumn="0" w:lastColumn="0" w:noHBand="0" w:noVBand="0" w:val="0020"/>
-        <w:tblCaption w:val="Rib–vertebra incidence at three stages: the raw union pseudolabel, after the students corrected the 148 triaged records, and the release after the lumbar-rib class and rule-based renumbering. Evaluable ribs are those whose expected vertebra lies in the field of view; a record is misnumbered when its ribs are consistently offset."/>
+        <w:tblCaption w:val="Rib–vertebra incidence at three stages: the raw union pseudolabel, after the students corrected the 148 triaged records, and the release after the lumbar-rib class and rule-based renumbering. Evaluable ribs are those whose expected vertebra lies in the field of view; offset, one or two levels from the vertebra the number implies; misnumbered, records whose ribs are consistently offset."/>
       </w:tblPr>
       <w:tblGrid>
         <w:gridCol w:w="1584"/>
@@ -2814,7 +2820,7 @@
               <w:jc w:val="right"/>
             </w:pPr>
             <w:r>
-              <w:t xml:space="preserve">Evaluable ribs</w:t>
+              <w:t xml:space="preserve">Evaluable</w:t>
             </w:r>
           </w:p>
         </w:tc>
@@ -2826,7 +2832,7 @@
               <w:jc w:val="right"/>
             </w:pPr>
             <w:r>
-              <w:t xml:space="preserve">On own vertebra</w:t>
+              <w:t xml:space="preserve">Own vertebra</w:t>
             </w:r>
           </w:p>
         </w:tc>
@@ -2850,7 +2856,7 @@
               <w:jc w:val="right"/>
             </w:pPr>
             <w:r>
-              <w:t xml:space="preserve">Misnumbered records</w:t>
+              <w:t xml:space="preserve">Misnumbered</w:t>
             </w:r>
           </w:p>
         </w:tc>
@@ -2906,7 +2912,7 @@
               <w:jc w:val="right"/>
             </w:pPr>
             <w:r>
-              <w:t xml:space="preserve">170 (3.1%)</w:t>
+              <w:t xml:space="preserve">3.1%</w:t>
             </w:r>
           </w:p>
         </w:tc>
@@ -2932,7 +2938,7 @@
               <w:jc w:val="left"/>
             </w:pPr>
             <w:r>
-              <w:t xml:space="preserve">After student correction</w:t>
+              <w:t xml:space="preserve">After correction</w:t>
             </w:r>
           </w:p>
         </w:tc>
@@ -2974,7 +2980,7 @@
               <w:jc w:val="right"/>
             </w:pPr>
             <w:r>
-              <w:t xml:space="preserve">109 (1.9%)</w:t>
+              <w:t xml:space="preserve">1.9%</w:t>
             </w:r>
           </w:p>
         </w:tc>
@@ -3042,7 +3048,7 @@
               <w:jc w:val="right"/>
             </w:pPr>
             <w:r>
-              <w:t xml:space="preserve">2 (0.035%)</w:t>
+              <w:t xml:space="preserve">0.035%</w:t>
             </w:r>
           </w:p>
         </w:tc>

</xml_diff>

<commit_message>
Ribs: every quality check in one table, the text only points at it
The release-stage incidence is named for what it is, a consistency check on renumbering
against the vertebrae; the raw and post-review rows are the independent measure.

Co-Authored-By: Claude Fable 5.1 <noreply@anthropic.com>
</commit_message>
<xml_diff>
--- a/paper/mpda/CTSpinoPelvic1K_single_column.docx
+++ b/paper/mpda/CTSpinoPelvic1K_single_column.docx
@@ -2625,75 +2625,7 @@
         <w:t xml:space="preserve"> </w:t>
       </w:r>
       <w:r>
-        <w:t xml:space="preserve">pseudolabels. A label-based rule flagged every record in which one rib bone carried more than</w:t>
-      </w:r>
-      <w:r>
-        <w:t xml:space="preserve"> </w:t>
-      </w:r>
-      <w:r>
-        <w:t xml:space="preserve">one identifier, or in which a rib failed to reach the vertebra it articulates with, since a</w:t>
-      </w:r>
-      <w:r>
-        <w:t xml:space="preserve"> </w:t>
-      </w:r>
-      <w:r>
-        <w:t xml:space="preserve">single bone carrying two numbers is a numbering error whatever the anatomy. On the raw union</w:t>
-      </w:r>
-      <w:r>
-        <w:t xml:space="preserve"> </w:t>
-      </w:r>
-      <w:r>
-        <w:t xml:space="preserve">the rule selected 152 records, with 584 rib bones carrying two identifiers among them; 148</w:t>
-      </w:r>
-      <w:r>
-        <w:t xml:space="preserve"> </w:t>
-      </w:r>
-      <w:r>
-        <w:t xml:space="preserve">were reviewed and corrected, and four were not and are identified in the release. Reviewers</w:t>
-      </w:r>
-      <w:r>
-        <w:t xml:space="preserve"> </w:t>
-      </w:r>
-      <w:r>
-        <w:t xml:space="preserve">were medical students working through  </w:t>
-      </w:r>
-      <w:r>
-        <w:t xml:space="preserve">, trained against a written</w:t>
-      </w:r>
-      <w:r>
-        <w:t xml:space="preserve"> </w:t>
-      </w:r>
-      <w:r>
-        <w:t xml:space="preserve">labeling protocol, with every correction attributed to its annotator. Records passing the rule</w:t>
-      </w:r>
-      <w:r>
-        <w:t xml:space="preserve"> </w:t>
-      </w:r>
-      <w:r>
-        <w:t xml:space="preserve">were not individually inspected; the rib–vertebra incidence check of</w:t>
-      </w:r>
-      <w:r>
-        <w:t xml:space="preserve"> </w:t>
-      </w:r>
-      <w:r>
-        <w:t xml:space="preserve">Sec. </w:t>
-      </w:r>
-      <w:hyperlink w:anchor="sec:validation">
-        <w:r>
-          <w:rPr>
-            <w:rStyle w:val="Hyperlink"/>
-          </w:rPr>
-          <w:t xml:space="preserve">2.6</w:t>
-        </w:r>
-      </w:hyperlink>
-      <w:r>
-        <w:t xml:space="preserve">, run at each stage, is the independent measure of what the rule and</w:t>
-      </w:r>
-      <w:r>
-        <w:t xml:space="preserve"> </w:t>
-      </w:r>
-      <w:r>
-        <w:t xml:space="preserve">the reviewers missed (Table </w:t>
+        <w:t xml:space="preserve">pseudolabels (Table </w:t>
       </w:r>
       <w:hyperlink w:anchor="tab:ribqc">
         <w:r>
@@ -2704,49 +2636,58 @@
         </w:r>
       </w:hyperlink>
       <w:r>
-        <w:t xml:space="preserve">). On the raw pseudolabel 3.1% of the evaluable</w:t>
-      </w:r>
-      <w:r>
-        <w:t xml:space="preserve"> </w:t>
-      </w:r>
-      <w:r>
-        <w:t xml:space="preserve">ribs sat one or two levels from the vertebra their number implies and 24 records carried a</w:t>
-      </w:r>
-      <w:r>
-        <w:t xml:space="preserve"> </w:t>
-      </w:r>
-      <w:r>
-        <w:t xml:space="preserve">misnumbered cage; the students’ corrections cut both by a third (1.9%, 16 records). What</w:t>
-      </w:r>
-      <w:r>
-        <w:t xml:space="preserve"> </w:t>
-      </w:r>
-      <w:r>
-        <w:t xml:space="preserve">remained were whole-side shifts that no reviewer had been asked to look for: once a rib on a</w:t>
-      </w:r>
-      <w:r>
-        <w:t xml:space="preserve"> </w:t>
-      </w:r>
-      <w:r>
-        <w:t xml:space="preserve">lumbar body received its own class, each side could be anchored on its most confident</w:t>
-      </w:r>
-      <w:r>
-        <w:t xml:space="preserve"> </w:t>
-      </w:r>
-      <w:r>
-        <w:t xml:space="preserve">articulation and renumbered by counting, which left two offset ribs in 5</w:t>
-      </w:r>
-      <w:r>
-        <w:t xml:space="preserve">,</w:t>
-      </w:r>
-      <w:r>
-        <w:t xml:space="preserve">749 and no</w:t>
-      </w:r>
-      <w:r>
-        <w:t xml:space="preserve"> </w:t>
-      </w:r>
-      <w:r>
-        <w:t xml:space="preserve">misnumbered record.</w:t>
+        <w:t xml:space="preserve">). Two label-based checks gated the triage: a rib bone</w:t>
+      </w:r>
+      <w:r>
+        <w:t xml:space="preserve"> </w:t>
+      </w:r>
+      <w:r>
+        <w:t xml:space="preserve">carrying two identifiers, and a rib that never reaches the spine. They selected 152 records;</w:t>
+      </w:r>
+      <w:r>
+        <w:t xml:space="preserve"> </w:t>
+      </w:r>
+      <w:r>
+        <w:t xml:space="preserve">148 were reviewed and corrected, and four were not and are identified in the release.</w:t>
+      </w:r>
+      <w:r>
+        <w:t xml:space="preserve"> </w:t>
+      </w:r>
+      <w:r>
+        <w:t xml:space="preserve">Reviewers were medical students working through  </w:t>
+      </w:r>
+      <w:r>
+        <w:t xml:space="preserve">, trained against a</w:t>
+      </w:r>
+      <w:r>
+        <w:t xml:space="preserve"> </w:t>
+      </w:r>
+      <w:r>
+        <w:t xml:space="preserve">written labeling protocol, with every correction attributed to its annotator, and a save was</w:t>
+      </w:r>
+      <w:r>
+        <w:t xml:space="preserve"> </w:t>
+      </w:r>
+      <w:r>
+        <w:t xml:space="preserve">refused until the review checks passed. Ribs are named for the vertebra they articulate with,</w:t>
+      </w:r>
+      <w:r>
+        <w:t xml:space="preserve"> </w:t>
+      </w:r>
+      <w:r>
+        <w:t xml:space="preserve">so after review the remaining whole-side shifts were renumbered against the vertebrae by rule;</w:t>
+      </w:r>
+      <w:r>
+        <w:t xml:space="preserve"> </w:t>
+      </w:r>
+      <w:r>
+        <w:t xml:space="preserve">the release-stage incidence is therefore a consistency check on that rule, and the two earlier</w:t>
+      </w:r>
+      <w:r>
+        <w:t xml:space="preserve"> </w:t>
+      </w:r>
+      <w:r>
+        <w:t xml:space="preserve">stages are the independent measure of the pseudolabel and of the reviewers.</w:t>
       </w:r>
     </w:p>
     <w:bookmarkStart w:id="16" w:name="tab:ribqc"/>
@@ -2755,46 +2696,61 @@
         <w:pStyle w:val="TableCaption"/>
       </w:pPr>
       <w:r>
-        <w:t xml:space="preserve">Rib–vertebra incidence at three stages: the raw union pseudolabel, after the</w:t>
-      </w:r>
-      <w:r>
-        <w:t xml:space="preserve"> </w:t>
-      </w:r>
-      <w:r>
-        <w:t xml:space="preserve">students corrected the 148 triaged records, and the release after the lumbar-rib class and</w:t>
-      </w:r>
-      <w:r>
-        <w:t xml:space="preserve"> </w:t>
-      </w:r>
-      <w:r>
-        <w:t xml:space="preserve">rule-based renumbering. Evaluable ribs are those whose expected vertebra lies in the field of</w:t>
-      </w:r>
-      <w:r>
-        <w:t xml:space="preserve"> </w:t>
-      </w:r>
-      <w:r>
-        <w:t xml:space="preserve">view; offset, one or two levels from the vertebra the number implies; misnumbered, records whose</w:t>
-      </w:r>
-      <w:r>
-        <w:t xml:space="preserve"> </w:t>
-      </w:r>
-      <w:r>
-        <w:t xml:space="preserve">ribs are consistently offset.</w:t>
+        <w:t xml:space="preserve">Rib quality control: the checks, when each ran, and what it found. Gate, blocks a</w:t>
+      </w:r>
+      <w:r>
+        <w:t xml:space="preserve"> </w:t>
+      </w:r>
+      <w:r>
+        <w:t xml:space="preserve">review or a release; advisory, reported only. Incidence rows: raw pseudolabel</w:t>
+      </w:r>
+      <w:r>
+        <w:t xml:space="preserve"> </w:t>
+      </w:r>
+      <m:oMath>
+        <m:r>
+          <m:rPr>
+            <m:sty m:val="p"/>
+          </m:rPr>
+          <m:t>→</m:t>
+        </m:r>
+      </m:oMath>
+      <w:r>
+        <w:t xml:space="preserve"> </w:t>
+      </w:r>
+      <w:r>
+        <w:t xml:space="preserve">after student correction</w:t>
+      </w:r>
+      <w:r>
+        <w:t xml:space="preserve"> </w:t>
+      </w:r>
+      <m:oMath>
+        <m:r>
+          <m:rPr>
+            <m:sty m:val="p"/>
+          </m:rPr>
+          <m:t>→</m:t>
+        </m:r>
+      </m:oMath>
+      <w:r>
+        <w:t xml:space="preserve"> </w:t>
+      </w:r>
+      <w:r>
+        <w:t xml:space="preserve">release.</w:t>
       </w:r>
     </w:p>
     <w:tbl>
       <w:tblPr>
         <w:tblStyle w:val="Table"/>
-        <w:tblW w:type="auto" w:w="0"/>
+        <w:tblW w:type="pct" w:w="2550"/>
+        <w:tblLayout w:type="fixed"/>
         <w:tblLook w:firstRow="1" w:lastRow="0" w:firstColumn="0" w:lastColumn="0" w:noHBand="0" w:noVBand="0" w:val="0020"/>
-        <w:tblCaption w:val="Rib–vertebra incidence at three stages: the raw union pseudolabel, after the students corrected the 148 triaged records, and the release after the lumbar-rib class and rule-based renumbering. Evaluable ribs are those whose expected vertebra lies in the field of view; offset, one or two levels from the vertebra the number implies; misnumbered, records whose ribs are consistently offset."/>
+        <w:tblCaption w:val="Rib quality control: the checks, when each ran, and what it found. Gate, blocks a review or a release; advisory, reported only. Incidence rows: raw pseudolabel \rightarrow after student correction \rightarrow release."/>
       </w:tblPr>
       <w:tblGrid>
+        <w:gridCol w:w="0"/>
         <w:gridCol w:w="1584"/>
-        <w:gridCol w:w="1584"/>
-        <w:gridCol w:w="1584"/>
-        <w:gridCol w:w="1584"/>
-        <w:gridCol w:w="1584"/>
+        <w:gridCol w:w="2455"/>
       </w:tblGrid>
       <w:tr>
         <w:trPr>
@@ -2808,6 +2764,18 @@
               <w:jc w:val="left"/>
             </w:pPr>
             <w:r>
+              <w:t xml:space="preserve">Check</w:t>
+            </w:r>
+          </w:p>
+        </w:tc>
+        <w:tc>
+          <w:tcPr/>
+          <w:p>
+            <w:pPr>
+              <w:pStyle w:val="Compact"/>
+              <w:jc w:val="left"/>
+            </w:pPr>
+            <w:r>
               <w:t xml:space="preserve">Stage</w:t>
             </w:r>
           </w:p>
@@ -2817,46 +2785,10 @@
           <w:p>
             <w:pPr>
               <w:pStyle w:val="Compact"/>
-              <w:jc w:val="right"/>
-            </w:pPr>
-            <w:r>
-              <w:t xml:space="preserve">Evaluable</w:t>
-            </w:r>
-          </w:p>
-        </w:tc>
-        <w:tc>
-          <w:tcPr/>
-          <w:p>
-            <w:pPr>
-              <w:pStyle w:val="Compact"/>
-              <w:jc w:val="right"/>
-            </w:pPr>
-            <w:r>
-              <w:t xml:space="preserve">Own vertebra</w:t>
-            </w:r>
-          </w:p>
-        </w:tc>
-        <w:tc>
-          <w:tcPr/>
-          <w:p>
-            <w:pPr>
-              <w:pStyle w:val="Compact"/>
-              <w:jc w:val="right"/>
-            </w:pPr>
-            <w:r>
-              <w:t xml:space="preserve">Offset</w:t>
-            </w:r>
-          </w:p>
-        </w:tc>
-        <w:tc>
-          <w:tcPr/>
-          <w:p>
-            <w:pPr>
-              <w:pStyle w:val="Compact"/>
-              <w:jc w:val="right"/>
-            </w:pPr>
-            <w:r>
-              <w:t xml:space="preserve">Misnumbered</w:t>
+              <w:jc w:val="left"/>
+            </w:pPr>
+            <w:r>
+              <w:t xml:space="preserve">Finding</w:t>
             </w:r>
           </w:p>
         </w:tc>
@@ -2870,61 +2802,31 @@
               <w:jc w:val="left"/>
             </w:pPr>
             <w:r>
-              <w:t xml:space="preserve">Raw pseudolabel</w:t>
-            </w:r>
-          </w:p>
-        </w:tc>
-        <w:tc>
-          <w:tcPr/>
-          <w:p>
-            <w:pPr>
-              <w:pStyle w:val="Compact"/>
-              <w:jc w:val="right"/>
-            </w:pPr>
-            <w:r>
-              <w:t xml:space="preserve">5</w:t>
-            </w:r>
-            <w:r>
-              <w:t xml:space="preserve">,</w:t>
-            </w:r>
-            <w:r>
-              <w:t xml:space="preserve">560</w:t>
-            </w:r>
-          </w:p>
-        </w:tc>
-        <w:tc>
-          <w:tcPr/>
-          <w:p>
-            <w:pPr>
-              <w:pStyle w:val="Compact"/>
-              <w:jc w:val="right"/>
-            </w:pPr>
-            <w:r>
-              <w:t xml:space="preserve">96.6%</w:t>
-            </w:r>
-          </w:p>
-        </w:tc>
-        <w:tc>
-          <w:tcPr/>
-          <w:p>
-            <w:pPr>
-              <w:pStyle w:val="Compact"/>
-              <w:jc w:val="right"/>
-            </w:pPr>
-            <w:r>
-              <w:t xml:space="preserve">3.1%</w:t>
-            </w:r>
-          </w:p>
-        </w:tc>
-        <w:tc>
-          <w:tcPr/>
-          <w:p>
-            <w:pPr>
-              <w:pStyle w:val="Compact"/>
-              <w:jc w:val="right"/>
-            </w:pPr>
-            <w:r>
-              <w:t xml:space="preserve">24</w:t>
+              <w:t xml:space="preserve">One bone, one number</w:t>
+            </w:r>
+          </w:p>
+        </w:tc>
+        <w:tc>
+          <w:tcPr/>
+          <w:p>
+            <w:pPr>
+              <w:pStyle w:val="Compact"/>
+              <w:jc w:val="left"/>
+            </w:pPr>
+            <w:r>
+              <w:t xml:space="preserve">triage, gate</w:t>
+            </w:r>
+          </w:p>
+        </w:tc>
+        <w:tc>
+          <w:tcPr/>
+          <w:p>
+            <w:pPr>
+              <w:pStyle w:val="Compact"/>
+              <w:jc w:val="left"/>
+            </w:pPr>
+            <w:r>
+              <w:t xml:space="preserve">584 bones, 152 records</w:t>
             </w:r>
           </w:p>
         </w:tc>
@@ -2938,61 +2840,31 @@
               <w:jc w:val="left"/>
             </w:pPr>
             <w:r>
-              <w:t xml:space="preserve">After correction</w:t>
-            </w:r>
-          </w:p>
-        </w:tc>
-        <w:tc>
-          <w:tcPr/>
-          <w:p>
-            <w:pPr>
-              <w:pStyle w:val="Compact"/>
-              <w:jc w:val="right"/>
-            </w:pPr>
-            <w:r>
-              <w:t xml:space="preserve">5</w:t>
-            </w:r>
-            <w:r>
-              <w:t xml:space="preserve">,</w:t>
-            </w:r>
-            <w:r>
-              <w:t xml:space="preserve">670</w:t>
-            </w:r>
-          </w:p>
-        </w:tc>
-        <w:tc>
-          <w:tcPr/>
-          <w:p>
-            <w:pPr>
-              <w:pStyle w:val="Compact"/>
-              <w:jc w:val="right"/>
-            </w:pPr>
-            <w:r>
-              <w:t xml:space="preserve">97.6%</w:t>
-            </w:r>
-          </w:p>
-        </w:tc>
-        <w:tc>
-          <w:tcPr/>
-          <w:p>
-            <w:pPr>
-              <w:pStyle w:val="Compact"/>
-              <w:jc w:val="right"/>
-            </w:pPr>
-            <w:r>
-              <w:t xml:space="preserve">1.9%</w:t>
-            </w:r>
-          </w:p>
-        </w:tc>
-        <w:tc>
-          <w:tcPr/>
-          <w:p>
-            <w:pPr>
-              <w:pStyle w:val="Compact"/>
-              <w:jc w:val="right"/>
-            </w:pPr>
-            <w:r>
-              <w:t xml:space="preserve">16</w:t>
+              <w:t xml:space="preserve">Rib reaches the spine</w:t>
+            </w:r>
+          </w:p>
+        </w:tc>
+        <w:tc>
+          <w:tcPr/>
+          <w:p>
+            <w:pPr>
+              <w:pStyle w:val="Compact"/>
+              <w:jc w:val="left"/>
+            </w:pPr>
+            <w:r>
+              <w:t xml:space="preserve">triage, gate</w:t>
+            </w:r>
+          </w:p>
+        </w:tc>
+        <w:tc>
+          <w:tcPr/>
+          <w:p>
+            <w:pPr>
+              <w:pStyle w:val="Compact"/>
+              <w:jc w:val="left"/>
+            </w:pPr>
+            <w:r>
+              <w:t xml:space="preserve">in the same 152</w:t>
             </w:r>
           </w:p>
         </w:tc>
@@ -3006,61 +2878,564 @@
               <w:jc w:val="left"/>
             </w:pPr>
             <w:r>
-              <w:t xml:space="preserve">Release</w:t>
-            </w:r>
-          </w:p>
-        </w:tc>
-        <w:tc>
-          <w:tcPr/>
-          <w:p>
-            <w:pPr>
-              <w:pStyle w:val="Compact"/>
-              <w:jc w:val="right"/>
-            </w:pPr>
-            <w:r>
-              <w:t xml:space="preserve">5</w:t>
+              <w:t xml:space="preserve">One piece per number</w:t>
+            </w:r>
+          </w:p>
+        </w:tc>
+        <w:tc>
+          <w:tcPr/>
+          <w:p>
+            <w:pPr>
+              <w:pStyle w:val="Compact"/>
+              <w:jc w:val="left"/>
+            </w:pPr>
+            <w:r>
+              <w:t xml:space="preserve">triage adv.; review gate</w:t>
+            </w:r>
+          </w:p>
+        </w:tc>
+        <w:tc>
+          <w:tcPr/>
+          <w:p>
+            <w:pPr>
+              <w:pStyle w:val="Compact"/>
+              <w:jc w:val="left"/>
+            </w:pPr>
+            <w:r>
+              <w:t xml:space="preserve">clipped ribs exempt</w:t>
+            </w:r>
+          </w:p>
+        </w:tc>
+      </w:tr>
+      <w:tr>
+        <w:tc>
+          <w:tcPr/>
+          <w:p>
+            <w:pPr>
+              <w:pStyle w:val="Compact"/>
+              <w:jc w:val="left"/>
+            </w:pPr>
+            <w:r>
+              <w:t xml:space="preserve">Consecutive per side</w:t>
+            </w:r>
+          </w:p>
+        </w:tc>
+        <w:tc>
+          <w:tcPr/>
+          <w:p>
+            <w:pPr>
+              <w:pStyle w:val="Compact"/>
+              <w:jc w:val="left"/>
+            </w:pPr>
+            <w:r>
+              <w:t xml:space="preserve">review, gate</w:t>
+            </w:r>
+          </w:p>
+        </w:tc>
+        <w:tc>
+          <w:tcPr/>
+          <w:p>
+            <w:pPr>
+              <w:pStyle w:val="Compact"/>
+              <w:jc w:val="left"/>
+            </w:pPr>
+            <w:r>
+              <w:t xml:space="preserve">no number missing</w:t>
+            </w:r>
+          </w:p>
+        </w:tc>
+      </w:tr>
+      <w:tr>
+        <w:tc>
+          <w:tcPr/>
+          <w:p>
+            <w:pPr>
+              <w:pStyle w:val="Compact"/>
+              <w:jc w:val="left"/>
+            </w:pPr>
+            <w:r>
+              <w:t xml:space="preserve">Rib</w:t>
+            </w:r>
+            <w:r>
+              <w:t xml:space="preserve"> </w:t>
+            </w:r>
+            <m:oMath>
+              <m:r>
+                <m:t>N</m:t>
+              </m:r>
+            </m:oMath>
+            <w:r>
+              <w:t xml:space="preserve"> </w:t>
+            </w:r>
+            <w:r>
+              <w:t xml:space="preserve">on T</w:t>
+            </w:r>
+            <m:oMath>
+              <m:r>
+                <m:t>N</m:t>
+              </m:r>
+            </m:oMath>
+          </w:p>
+        </w:tc>
+        <w:tc>
+          <w:tcPr/>
+          <w:p>
+            <w:pPr>
+              <w:pStyle w:val="Compact"/>
+              <w:jc w:val="left"/>
+            </w:pPr>
+            <w:r>
+              <w:t xml:space="preserve">triage adv.; review gate</w:t>
+            </w:r>
+          </w:p>
+        </w:tc>
+        <w:tc>
+          <w:tcPr/>
+          <w:p>
+            <w:pPr>
+              <w:pStyle w:val="Compact"/>
+              <w:jc w:val="left"/>
+            </w:pPr>
+            <w:r>
+              <w:t xml:space="preserve">within 10 mm, where T</w:t>
+            </w:r>
+            <m:oMath>
+              <m:r>
+                <m:t>N</m:t>
+              </m:r>
+            </m:oMath>
+            <w:r>
+              <w:t xml:space="preserve"> </w:t>
+            </w:r>
+            <w:r>
+              <w:t xml:space="preserve">labeled</w:t>
+            </w:r>
+          </w:p>
+        </w:tc>
+      </w:tr>
+      <w:tr>
+        <w:tc>
+          <w:tcPr/>
+          <w:p>
+            <w:pPr>
+              <w:pStyle w:val="Compact"/>
+              <w:jc w:val="left"/>
+            </w:pPr>
+            <w:r>
+              <w:t xml:space="preserve">Spine untouched</w:t>
+            </w:r>
+          </w:p>
+        </w:tc>
+        <w:tc>
+          <w:tcPr/>
+          <w:p>
+            <w:pPr>
+              <w:pStyle w:val="Compact"/>
+              <w:jc w:val="left"/>
+            </w:pPr>
+            <w:r>
+              <w:t xml:space="preserve">review, gate</w:t>
+            </w:r>
+          </w:p>
+        </w:tc>
+        <w:tc>
+          <w:tcPr/>
+          <w:p>
+            <w:pPr>
+              <w:pStyle w:val="Compact"/>
+              <w:jc w:val="left"/>
+            </w:pPr>
+            <w:r>
+              <w:t xml:space="preserve">no vertebra altered</w:t>
+            </w:r>
+          </w:p>
+        </w:tc>
+      </w:tr>
+      <w:tr>
+        <w:tc>
+          <w:tcPr/>
+          <w:p>
+            <w:pPr>
+              <w:pStyle w:val="Compact"/>
+              <w:jc w:val="left"/>
+            </w:pPr>
+            <w:r>
+              <w:t xml:space="preserve">Unlabeled vertebra in view</w:t>
+            </w:r>
+          </w:p>
+        </w:tc>
+        <w:tc>
+          <w:tcPr/>
+          <w:p>
+            <w:pPr>
+              <w:pStyle w:val="Compact"/>
+              <w:jc w:val="left"/>
+            </w:pPr>
+            <w:r>
+              <w:t xml:space="preserve">triage, report</w:t>
+            </w:r>
+          </w:p>
+        </w:tc>
+        <w:tc>
+          <w:tcPr/>
+          <w:p>
+            <w:pPr>
+              <w:pStyle w:val="Compact"/>
+              <w:jc w:val="left"/>
+            </w:pPr>
+            <w:r>
+              <w:t xml:space="preserve">interior gap; rib above top label</w:t>
+            </w:r>
+          </w:p>
+        </w:tc>
+      </w:tr>
+      <w:tr>
+        <w:tc>
+          <w:tcPr/>
+          <w:p>
+            <w:pPr>
+              <w:pStyle w:val="Compact"/>
+              <w:jc w:val="left"/>
+            </w:pPr>
+            <w:r>
+              <w:t xml:space="preserve">Lumbar rib</w:t>
+            </w:r>
+            <w:r>
+              <w:t xml:space="preserve"> </w:t>
+            </w:r>
+            <m:oMath>
+              <m:r>
+                <m:rPr>
+                  <m:sty m:val="p"/>
+                </m:rPr>
+                <m:t>→</m:t>
+              </m:r>
+            </m:oMath>
+            <w:r>
+              <w:t xml:space="preserve"> </w:t>
+            </w:r>
+            <w:r>
+              <w:t xml:space="preserve">60/61</w:t>
+            </w:r>
+          </w:p>
+        </w:tc>
+        <w:tc>
+          <w:tcPr/>
+          <w:p>
+            <w:pPr>
+              <w:pStyle w:val="Compact"/>
+              <w:jc w:val="left"/>
+            </w:pPr>
+            <w:r>
+              <w:t xml:space="preserve">post-review rule</w:t>
+            </w:r>
+          </w:p>
+        </w:tc>
+        <w:tc>
+          <w:tcPr/>
+          <w:p>
+            <w:pPr>
+              <w:pStyle w:val="Compact"/>
+              <w:jc w:val="left"/>
+            </w:pPr>
+            <w:r>
+              <w:t xml:space="preserve">16 records</w:t>
+            </w:r>
+          </w:p>
+        </w:tc>
+      </w:tr>
+      <w:tr>
+        <w:tc>
+          <w:tcPr/>
+          <w:p>
+            <w:pPr>
+              <w:pStyle w:val="Compact"/>
+              <w:jc w:val="left"/>
+            </w:pPr>
+            <w:r>
+              <w:t xml:space="preserve">Whole-cage shift</w:t>
+            </w:r>
+          </w:p>
+        </w:tc>
+        <w:tc>
+          <w:tcPr/>
+          <w:p>
+            <w:pPr>
+              <w:pStyle w:val="Compact"/>
+              <w:jc w:val="left"/>
+            </w:pPr>
+            <w:r>
+              <w:t xml:space="preserve">post-review rule</w:t>
+            </w:r>
+          </w:p>
+        </w:tc>
+        <w:tc>
+          <w:tcPr/>
+          <w:p>
+            <w:pPr>
+              <w:pStyle w:val="Compact"/>
+              <w:jc w:val="left"/>
+            </w:pPr>
+            <w:r>
+              <w:t xml:space="preserve">11 of 27 cases; rest decided by hand</w:t>
+            </w:r>
+          </w:p>
+        </w:tc>
+      </w:tr>
+      <w:tr>
+        <w:tc>
+          <w:tcPr/>
+          <w:p>
+            <w:pPr>
+              <w:pStyle w:val="Compact"/>
+              <w:jc w:val="left"/>
+            </w:pPr>
+            <w:r>
+              <w:t xml:space="preserve">Anchor, count outward</w:t>
+            </w:r>
+          </w:p>
+        </w:tc>
+        <w:tc>
+          <w:tcPr/>
+          <w:p>
+            <w:pPr>
+              <w:pStyle w:val="Compact"/>
+              <w:jc w:val="left"/>
+            </w:pPr>
+            <w:r>
+              <w:t xml:space="preserve">post-review rule</w:t>
+            </w:r>
+          </w:p>
+        </w:tc>
+        <w:tc>
+          <w:tcPr/>
+          <w:p>
+            <w:pPr>
+              <w:pStyle w:val="Compact"/>
+              <w:jc w:val="left"/>
+            </w:pPr>
+            <w:r>
+              <w:t xml:space="preserve">left checked against right</w:t>
+            </w:r>
+          </w:p>
+        </w:tc>
+      </w:tr>
+      <w:tr>
+        <w:tc>
+          <w:tcPr/>
+          <w:p>
+            <w:pPr>
+              <w:pStyle w:val="Compact"/>
+              <w:jc w:val="left"/>
+            </w:pPr>
+            <w:r>
+              <w:t xml:space="preserve">Geometry, ids, sides</w:t>
+            </w:r>
+          </w:p>
+        </w:tc>
+        <w:tc>
+          <w:tcPr/>
+          <w:p>
+            <w:pPr>
+              <w:pStyle w:val="Compact"/>
+              <w:jc w:val="left"/>
+            </w:pPr>
+            <w:r>
+              <w:t xml:space="preserve">release, gate</w:t>
+            </w:r>
+          </w:p>
+        </w:tc>
+        <w:tc>
+          <w:tcPr/>
+          <w:p>
+            <w:pPr>
+              <w:pStyle w:val="Compact"/>
+              <w:jc w:val="left"/>
+            </w:pPr>
+            <w:r>
+              <w:t xml:space="preserve">802/802</w:t>
+            </w:r>
+          </w:p>
+        </w:tc>
+      </w:tr>
+      <w:tr>
+        <w:tc>
+          <w:tcPr/>
+          <w:p>
+            <w:pPr>
+              <w:pStyle w:val="Compact"/>
+              <w:jc w:val="left"/>
+            </w:pPr>
+            <w:r>
+              <w:t xml:space="preserve">Rib–vertebra incidence</w:t>
+            </w:r>
+          </w:p>
+        </w:tc>
+        <w:tc>
+          <w:tcPr/>
+          <w:p>
+            <w:pPr>
+              <w:pStyle w:val="Compact"/>
+              <w:jc w:val="left"/>
+            </w:pPr>
+            <w:r>
+              <w:t xml:space="preserve">every stage</w:t>
+            </w:r>
+          </w:p>
+        </w:tc>
+        <w:tc>
+          <w:tcPr/>
+          <w:p>
+            <w:pPr>
+              <w:pStyle w:val="Compact"/>
+              <w:jc w:val="left"/>
+            </w:pPr>
+            <w:r>
+              <w:t xml:space="preserve">offset 3.1%</w:t>
+            </w:r>
+            <w:r>
+              <w:t xml:space="preserve"> </w:t>
+            </w:r>
+            <m:oMath>
+              <m:r>
+                <m:rPr>
+                  <m:sty m:val="p"/>
+                </m:rPr>
+                <m:t>→</m:t>
+              </m:r>
+            </m:oMath>
+            <w:r>
+              <w:t xml:space="preserve"> </w:t>
+            </w:r>
+            <w:r>
+              <w:t xml:space="preserve">1.9%</w:t>
+            </w:r>
+            <w:r>
+              <w:t xml:space="preserve"> </w:t>
+            </w:r>
+            <m:oMath>
+              <m:r>
+                <m:rPr>
+                  <m:sty m:val="p"/>
+                </m:rPr>
+                <m:t>→</m:t>
+              </m:r>
+            </m:oMath>
+            <w:r>
+              <w:t xml:space="preserve"> </w:t>
+            </w:r>
+            <w:r>
+              <w:t xml:space="preserve">0.035%; misnumbered records 24</w:t>
+            </w:r>
+            <w:r>
+              <w:t xml:space="preserve"> </w:t>
+            </w:r>
+            <m:oMath>
+              <m:r>
+                <m:rPr>
+                  <m:sty m:val="p"/>
+                </m:rPr>
+                <m:t>→</m:t>
+              </m:r>
+            </m:oMath>
+            <w:r>
+              <w:t xml:space="preserve"> </w:t>
+            </w:r>
+            <w:r>
+              <w:t xml:space="preserve">16</w:t>
+            </w:r>
+            <w:r>
+              <w:t xml:space="preserve"> </w:t>
+            </w:r>
+            <m:oMath>
+              <m:r>
+                <m:rPr>
+                  <m:sty m:val="p"/>
+                </m:rPr>
+                <m:t>→</m:t>
+              </m:r>
+            </m:oMath>
+            <w:r>
+              <w:t xml:space="preserve"> </w:t>
+            </w:r>
+            <w:r>
+              <w:t xml:space="preserve">0; evaluable 5</w:t>
             </w:r>
             <w:r>
               <w:t xml:space="preserve">,</w:t>
             </w:r>
             <w:r>
+              <w:t xml:space="preserve">560 / 5</w:t>
+            </w:r>
+            <w:r>
+              <w:t xml:space="preserve">,</w:t>
+            </w:r>
+            <w:r>
+              <w:t xml:space="preserve">670 / 5</w:t>
+            </w:r>
+            <w:r>
+              <w:t xml:space="preserve">,</w:t>
+            </w:r>
+            <w:r>
               <w:t xml:space="preserve">749</w:t>
             </w:r>
           </w:p>
         </w:tc>
-        <w:tc>
-          <w:tcPr/>
-          <w:p>
-            <w:pPr>
-              <w:pStyle w:val="Compact"/>
-              <w:jc w:val="right"/>
-            </w:pPr>
-            <w:r>
-              <w:t xml:space="preserve">99.97%</w:t>
-            </w:r>
-          </w:p>
-        </w:tc>
-        <w:tc>
-          <w:tcPr/>
-          <w:p>
-            <w:pPr>
-              <w:pStyle w:val="Compact"/>
-              <w:jc w:val="right"/>
-            </w:pPr>
-            <w:r>
-              <w:t xml:space="preserve">0.035%</w:t>
-            </w:r>
-          </w:p>
-        </w:tc>
-        <w:tc>
-          <w:tcPr/>
-          <w:p>
-            <w:pPr>
-              <w:pStyle w:val="Compact"/>
-              <w:jc w:val="right"/>
-            </w:pPr>
-            <w:r>
-              <w:t xml:space="preserve">0</w:t>
+      </w:tr>
+      <w:tr>
+        <w:tc>
+          <w:tcPr/>
+          <w:p>
+            <w:pPr>
+              <w:pStyle w:val="Compact"/>
+              <w:jc w:val="left"/>
+            </w:pPr>
+            <w:r>
+              <w:t xml:space="preserve">Physiological envelope</w:t>
+            </w:r>
+          </w:p>
+        </w:tc>
+        <w:tc>
+          <w:tcPr/>
+          <w:p>
+            <w:pPr>
+              <w:pStyle w:val="Compact"/>
+              <w:jc w:val="left"/>
+            </w:pPr>
+            <w:r>
+              <w:t xml:space="preserve">release, report</w:t>
+            </w:r>
+          </w:p>
+        </w:tc>
+        <w:tc>
+          <w:tcPr/>
+          <w:p>
+            <w:pPr>
+              <w:pStyle w:val="Compact"/>
+              <w:jc w:val="left"/>
+            </w:pPr>
+            <w:r>
+              <w:t xml:space="preserve">391 of</w:t>
+            </w:r>
+            <w:r>
+              <w:t xml:space="preserve"> </w:t>
+            </w:r>
+            <m:oMath>
+              <m:r>
+                <m:rPr>
+                  <m:sty m:val="p"/>
+                </m:rPr>
+                <m:t>∼</m:t>
+              </m:r>
+            </m:oMath>
+            <w:r>
+              <w:t xml:space="preserve">75</w:t>
+            </w:r>
+            <w:r>
+              <w:t xml:space="preserve">,</w:t>
+            </w:r>
+            <w:r>
+              <w:t xml:space="preserve">000 values</w:t>
             </w:r>
           </w:p>
         </w:tc>

</xml_diff>

<commit_message>
Rib QC table condensed to one row per stage
Co-Authored-By: Claude Fable 5.1 <noreply@anthropic.com>
</commit_message>
<xml_diff>
--- a/paper/mpda/CTSpinoPelvic1K_single_column.docx
+++ b/paper/mpda/CTSpinoPelvic1K_single_column.docx
@@ -2696,13 +2696,13 @@
         <w:pStyle w:val="TableCaption"/>
       </w:pPr>
       <w:r>
-        <w:t xml:space="preserve">Rib quality control: the checks, when each ran, and what it found. Gate, blocks a</w:t>
-      </w:r>
-      <w:r>
-        <w:t xml:space="preserve"> </w:t>
-      </w:r>
-      <w:r>
-        <w:t xml:space="preserve">review or a release; advisory, reported only. Incidence rows: raw pseudolabel</w:t>
+        <w:t xml:space="preserve">Rib quality control by stage. Gates block a save or a release; rules run after</w:t>
+      </w:r>
+      <w:r>
+        <w:t xml:space="preserve"> </w:t>
+      </w:r>
+      <w:r>
+        <w:t xml:space="preserve">review. Incidence: raw pseudolabel</w:t>
       </w:r>
       <w:r>
         <w:t xml:space="preserve"> </w:t>
@@ -2742,15 +2742,15 @@
     <w:tbl>
       <w:tblPr>
         <w:tblStyle w:val="Table"/>
-        <w:tblW w:type="pct" w:w="2550"/>
+        <w:tblW w:type="pct" w:w="3050"/>
         <w:tblLayout w:type="fixed"/>
         <w:tblLook w:firstRow="1" w:lastRow="0" w:firstColumn="0" w:lastColumn="0" w:noHBand="0" w:noVBand="0" w:val="0020"/>
-        <w:tblCaption w:val="Rib quality control: the checks, when each ran, and what it found. Gate, blocks a review or a release; advisory, reported only. Incidence rows: raw pseudolabel \rightarrow after student correction \rightarrow release."/>
+        <w:tblCaption w:val="Rib quality control by stage. Gates block a save or a release; rules run after review. Incidence: raw pseudolabel \rightarrow after student correction \rightarrow release."/>
       </w:tblPr>
       <w:tblGrid>
         <w:gridCol w:w="0"/>
-        <w:gridCol w:w="1584"/>
-        <w:gridCol w:w="2455"/>
+        <w:gridCol w:w="2692"/>
+        <w:gridCol w:w="2138"/>
       </w:tblGrid>
       <w:tr>
         <w:trPr>
@@ -2764,7 +2764,7 @@
               <w:jc w:val="left"/>
             </w:pPr>
             <w:r>
-              <w:t xml:space="preserve">Check</w:t>
+              <w:t xml:space="preserve">Stage</w:t>
             </w:r>
           </w:p>
         </w:tc>
@@ -2776,7 +2776,7 @@
               <w:jc w:val="left"/>
             </w:pPr>
             <w:r>
-              <w:t xml:space="preserve">Stage</w:t>
+              <w:t xml:space="preserve">Checks</w:t>
             </w:r>
           </w:p>
         </w:tc>
@@ -2802,7 +2802,7 @@
               <w:jc w:val="left"/>
             </w:pPr>
             <w:r>
-              <w:t xml:space="preserve">One bone, one number</w:t>
+              <w:t xml:space="preserve">Triage gates</w:t>
             </w:r>
           </w:p>
         </w:tc>
@@ -2814,7 +2814,7 @@
               <w:jc w:val="left"/>
             </w:pPr>
             <w:r>
-              <w:t xml:space="preserve">triage, gate</w:t>
+              <w:t xml:space="preserve">one bone, one number; rib reaches the spine</w:t>
             </w:r>
           </w:p>
         </w:tc>
@@ -2826,7 +2826,7 @@
               <w:jc w:val="left"/>
             </w:pPr>
             <w:r>
-              <w:t xml:space="preserve">584 bones, 152 records</w:t>
+              <w:t xml:space="preserve">152 records, 584 bones</w:t>
             </w:r>
           </w:p>
         </w:tc>
@@ -2840,7 +2840,7 @@
               <w:jc w:val="left"/>
             </w:pPr>
             <w:r>
-              <w:t xml:space="preserve">Rib reaches the spine</w:t>
+              <w:t xml:space="preserve">Review gates</w:t>
             </w:r>
           </w:p>
         </w:tc>
@@ -2852,7 +2852,29 @@
               <w:jc w:val="left"/>
             </w:pPr>
             <w:r>
-              <w:t xml:space="preserve">triage, gate</w:t>
+              <w:t xml:space="preserve">one piece; consecutive; rib</w:t>
+            </w:r>
+            <w:r>
+              <w:t xml:space="preserve"> </w:t>
+            </w:r>
+            <m:oMath>
+              <m:r>
+                <m:t>N</m:t>
+              </m:r>
+            </m:oMath>
+            <w:r>
+              <w:t xml:space="preserve"> </w:t>
+            </w:r>
+            <w:r>
+              <w:t xml:space="preserve">on T</w:t>
+            </w:r>
+            <m:oMath>
+              <m:r>
+                <m:t>N</m:t>
+              </m:r>
+            </m:oMath>
+            <w:r>
+              <w:t xml:space="preserve">; spine untouched</w:t>
             </w:r>
           </w:p>
         </w:tc>
@@ -2864,7 +2886,7 @@
               <w:jc w:val="left"/>
             </w:pPr>
             <w:r>
-              <w:t xml:space="preserve">in the same 152</w:t>
+              <w:t xml:space="preserve">148 corrected, 4 not</w:t>
             </w:r>
           </w:p>
         </w:tc>
@@ -2878,7 +2900,7 @@
               <w:jc w:val="left"/>
             </w:pPr>
             <w:r>
-              <w:t xml:space="preserve">One piece per number</w:t>
+              <w:t xml:space="preserve">Rules</w:t>
             </w:r>
           </w:p>
         </w:tc>
@@ -2890,7 +2912,24 @@
               <w:jc w:val="left"/>
             </w:pPr>
             <w:r>
-              <w:t xml:space="preserve">triage adv.; review gate</w:t>
+              <w:t xml:space="preserve">lumbar rib</w:t>
+            </w:r>
+            <w:r>
+              <w:t xml:space="preserve"> </w:t>
+            </w:r>
+            <m:oMath>
+              <m:r>
+                <m:rPr>
+                  <m:sty m:val="p"/>
+                </m:rPr>
+                <m:t>→</m:t>
+              </m:r>
+            </m:oMath>
+            <w:r>
+              <w:t xml:space="preserve"> </w:t>
+            </w:r>
+            <w:r>
+              <w:t xml:space="preserve">60/61; cage shift; anchor and count</w:t>
             </w:r>
           </w:p>
         </w:tc>
@@ -2902,7 +2941,7 @@
               <w:jc w:val="left"/>
             </w:pPr>
             <w:r>
-              <w:t xml:space="preserve">clipped ribs exempt</w:t>
+              <w:t xml:space="preserve">16 records; 11 of 27 shifted</w:t>
             </w:r>
           </w:p>
         </w:tc>
@@ -2916,7 +2955,7 @@
               <w:jc w:val="left"/>
             </w:pPr>
             <w:r>
-              <w:t xml:space="preserve">Consecutive per side</w:t>
+              <w:t xml:space="preserve">Release gates</w:t>
             </w:r>
           </w:p>
         </w:tc>
@@ -2928,7 +2967,7 @@
               <w:jc w:val="left"/>
             </w:pPr>
             <w:r>
-              <w:t xml:space="preserve">review, gate</w:t>
+              <w:t xml:space="preserve">geometry, ids, sides; physiological envelope</w:t>
             </w:r>
           </w:p>
         </w:tc>
@@ -2940,7 +2979,27 @@
               <w:jc w:val="left"/>
             </w:pPr>
             <w:r>
-              <w:t xml:space="preserve">no number missing</w:t>
+              <w:t xml:space="preserve">802/802; 391 of</w:t>
+            </w:r>
+            <w:r>
+              <w:t xml:space="preserve"> </w:t>
+            </w:r>
+            <m:oMath>
+              <m:r>
+                <m:rPr>
+                  <m:sty m:val="p"/>
+                </m:rPr>
+                <m:t>∼</m:t>
+              </m:r>
+            </m:oMath>
+            <w:r>
+              <w:t xml:space="preserve">75</w:t>
+            </w:r>
+            <w:r>
+              <w:t xml:space="preserve">,</w:t>
+            </w:r>
+            <w:r>
+              <w:t xml:space="preserve">000 values</w:t>
             </w:r>
           </w:p>
         </w:tc>
@@ -2954,27 +3013,8 @@
               <w:jc w:val="left"/>
             </w:pPr>
             <w:r>
-              <w:t xml:space="preserve">Rib</w:t>
-            </w:r>
-            <w:r>
-              <w:t xml:space="preserve"> </w:t>
-            </w:r>
-            <m:oMath>
-              <m:r>
-                <m:t>N</m:t>
-              </m:r>
-            </m:oMath>
-            <w:r>
-              <w:t xml:space="preserve"> </w:t>
-            </w:r>
-            <w:r>
-              <w:t xml:space="preserve">on T</w:t>
-            </w:r>
-            <m:oMath>
-              <m:r>
-                <m:t>N</m:t>
-              </m:r>
-            </m:oMath>
+              <w:t xml:space="preserve">Incidence</w:t>
+            </w:r>
           </w:p>
         </w:tc>
         <w:tc>
@@ -2985,7 +3025,7 @@
               <w:jc w:val="left"/>
             </w:pPr>
             <w:r>
-              <w:t xml:space="preserve">triage adv.; review gate</w:t>
+              <w:t xml:space="preserve">offset ribs / misnumbered records</w:t>
             </w:r>
           </w:p>
         </w:tc>
@@ -2997,108 +3037,7 @@
               <w:jc w:val="left"/>
             </w:pPr>
             <w:r>
-              <w:t xml:space="preserve">within 10 mm, where T</w:t>
-            </w:r>
-            <m:oMath>
-              <m:r>
-                <m:t>N</m:t>
-              </m:r>
-            </m:oMath>
-            <w:r>
-              <w:t xml:space="preserve"> </w:t>
-            </w:r>
-            <w:r>
-              <w:t xml:space="preserve">labeled</w:t>
-            </w:r>
-          </w:p>
-        </w:tc>
-      </w:tr>
-      <w:tr>
-        <w:tc>
-          <w:tcPr/>
-          <w:p>
-            <w:pPr>
-              <w:pStyle w:val="Compact"/>
-              <w:jc w:val="left"/>
-            </w:pPr>
-            <w:r>
-              <w:t xml:space="preserve">Spine untouched</w:t>
-            </w:r>
-          </w:p>
-        </w:tc>
-        <w:tc>
-          <w:tcPr/>
-          <w:p>
-            <w:pPr>
-              <w:pStyle w:val="Compact"/>
-              <w:jc w:val="left"/>
-            </w:pPr>
-            <w:r>
-              <w:t xml:space="preserve">review, gate</w:t>
-            </w:r>
-          </w:p>
-        </w:tc>
-        <w:tc>
-          <w:tcPr/>
-          <w:p>
-            <w:pPr>
-              <w:pStyle w:val="Compact"/>
-              <w:jc w:val="left"/>
-            </w:pPr>
-            <w:r>
-              <w:t xml:space="preserve">no vertebra altered</w:t>
-            </w:r>
-          </w:p>
-        </w:tc>
-      </w:tr>
-      <w:tr>
-        <w:tc>
-          <w:tcPr/>
-          <w:p>
-            <w:pPr>
-              <w:pStyle w:val="Compact"/>
-              <w:jc w:val="left"/>
-            </w:pPr>
-            <w:r>
-              <w:t xml:space="preserve">Unlabeled vertebra in view</w:t>
-            </w:r>
-          </w:p>
-        </w:tc>
-        <w:tc>
-          <w:tcPr/>
-          <w:p>
-            <w:pPr>
-              <w:pStyle w:val="Compact"/>
-              <w:jc w:val="left"/>
-            </w:pPr>
-            <w:r>
-              <w:t xml:space="preserve">triage, report</w:t>
-            </w:r>
-          </w:p>
-        </w:tc>
-        <w:tc>
-          <w:tcPr/>
-          <w:p>
-            <w:pPr>
-              <w:pStyle w:val="Compact"/>
-              <w:jc w:val="left"/>
-            </w:pPr>
-            <w:r>
-              <w:t xml:space="preserve">interior gap; rib above top label</w:t>
-            </w:r>
-          </w:p>
-        </w:tc>
-      </w:tr>
-      <w:tr>
-        <w:tc>
-          <w:tcPr/>
-          <w:p>
-            <w:pPr>
-              <w:pStyle w:val="Compact"/>
-              <w:jc w:val="left"/>
-            </w:pPr>
-            <w:r>
-              <w:t xml:space="preserve">Lumbar rib</w:t>
+              <w:t xml:space="preserve">3.1%/24</w:t>
             </w:r>
             <w:r>
               <w:t xml:space="preserve"> </w:t>
@@ -3115,183 +3054,7 @@
               <w:t xml:space="preserve"> </w:t>
             </w:r>
             <w:r>
-              <w:t xml:space="preserve">60/61</w:t>
-            </w:r>
-          </w:p>
-        </w:tc>
-        <w:tc>
-          <w:tcPr/>
-          <w:p>
-            <w:pPr>
-              <w:pStyle w:val="Compact"/>
-              <w:jc w:val="left"/>
-            </w:pPr>
-            <w:r>
-              <w:t xml:space="preserve">post-review rule</w:t>
-            </w:r>
-          </w:p>
-        </w:tc>
-        <w:tc>
-          <w:tcPr/>
-          <w:p>
-            <w:pPr>
-              <w:pStyle w:val="Compact"/>
-              <w:jc w:val="left"/>
-            </w:pPr>
-            <w:r>
-              <w:t xml:space="preserve">16 records</w:t>
-            </w:r>
-          </w:p>
-        </w:tc>
-      </w:tr>
-      <w:tr>
-        <w:tc>
-          <w:tcPr/>
-          <w:p>
-            <w:pPr>
-              <w:pStyle w:val="Compact"/>
-              <w:jc w:val="left"/>
-            </w:pPr>
-            <w:r>
-              <w:t xml:space="preserve">Whole-cage shift</w:t>
-            </w:r>
-          </w:p>
-        </w:tc>
-        <w:tc>
-          <w:tcPr/>
-          <w:p>
-            <w:pPr>
-              <w:pStyle w:val="Compact"/>
-              <w:jc w:val="left"/>
-            </w:pPr>
-            <w:r>
-              <w:t xml:space="preserve">post-review rule</w:t>
-            </w:r>
-          </w:p>
-        </w:tc>
-        <w:tc>
-          <w:tcPr/>
-          <w:p>
-            <w:pPr>
-              <w:pStyle w:val="Compact"/>
-              <w:jc w:val="left"/>
-            </w:pPr>
-            <w:r>
-              <w:t xml:space="preserve">11 of 27 cases; rest decided by hand</w:t>
-            </w:r>
-          </w:p>
-        </w:tc>
-      </w:tr>
-      <w:tr>
-        <w:tc>
-          <w:tcPr/>
-          <w:p>
-            <w:pPr>
-              <w:pStyle w:val="Compact"/>
-              <w:jc w:val="left"/>
-            </w:pPr>
-            <w:r>
-              <w:t xml:space="preserve">Anchor, count outward</w:t>
-            </w:r>
-          </w:p>
-        </w:tc>
-        <w:tc>
-          <w:tcPr/>
-          <w:p>
-            <w:pPr>
-              <w:pStyle w:val="Compact"/>
-              <w:jc w:val="left"/>
-            </w:pPr>
-            <w:r>
-              <w:t xml:space="preserve">post-review rule</w:t>
-            </w:r>
-          </w:p>
-        </w:tc>
-        <w:tc>
-          <w:tcPr/>
-          <w:p>
-            <w:pPr>
-              <w:pStyle w:val="Compact"/>
-              <w:jc w:val="left"/>
-            </w:pPr>
-            <w:r>
-              <w:t xml:space="preserve">left checked against right</w:t>
-            </w:r>
-          </w:p>
-        </w:tc>
-      </w:tr>
-      <w:tr>
-        <w:tc>
-          <w:tcPr/>
-          <w:p>
-            <w:pPr>
-              <w:pStyle w:val="Compact"/>
-              <w:jc w:val="left"/>
-            </w:pPr>
-            <w:r>
-              <w:t xml:space="preserve">Geometry, ids, sides</w:t>
-            </w:r>
-          </w:p>
-        </w:tc>
-        <w:tc>
-          <w:tcPr/>
-          <w:p>
-            <w:pPr>
-              <w:pStyle w:val="Compact"/>
-              <w:jc w:val="left"/>
-            </w:pPr>
-            <w:r>
-              <w:t xml:space="preserve">release, gate</w:t>
-            </w:r>
-          </w:p>
-        </w:tc>
-        <w:tc>
-          <w:tcPr/>
-          <w:p>
-            <w:pPr>
-              <w:pStyle w:val="Compact"/>
-              <w:jc w:val="left"/>
-            </w:pPr>
-            <w:r>
-              <w:t xml:space="preserve">802/802</w:t>
-            </w:r>
-          </w:p>
-        </w:tc>
-      </w:tr>
-      <w:tr>
-        <w:tc>
-          <w:tcPr/>
-          <w:p>
-            <w:pPr>
-              <w:pStyle w:val="Compact"/>
-              <w:jc w:val="left"/>
-            </w:pPr>
-            <w:r>
-              <w:t xml:space="preserve">Rib–vertebra incidence</w:t>
-            </w:r>
-          </w:p>
-        </w:tc>
-        <w:tc>
-          <w:tcPr/>
-          <w:p>
-            <w:pPr>
-              <w:pStyle w:val="Compact"/>
-              <w:jc w:val="left"/>
-            </w:pPr>
-            <w:r>
-              <w:t xml:space="preserve">every stage</w:t>
-            </w:r>
-          </w:p>
-        </w:tc>
-        <w:tc>
-          <w:tcPr/>
-          <w:p>
-            <w:pPr>
-              <w:pStyle w:val="Compact"/>
-              <w:jc w:val="left"/>
-            </w:pPr>
-            <w:r>
-              <w:t xml:space="preserve">offset 3.1%</w:t>
+              <w:t xml:space="preserve">1.9%/16</w:t>
             </w:r>
             <w:r>
               <w:t xml:space="preserve"> </w:t>
@@ -3308,134 +3071,7 @@
               <w:t xml:space="preserve"> </w:t>
             </w:r>
             <w:r>
-              <w:t xml:space="preserve">1.9%</w:t>
-            </w:r>
-            <w:r>
-              <w:t xml:space="preserve"> </w:t>
-            </w:r>
-            <m:oMath>
-              <m:r>
-                <m:rPr>
-                  <m:sty m:val="p"/>
-                </m:rPr>
-                <m:t>→</m:t>
-              </m:r>
-            </m:oMath>
-            <w:r>
-              <w:t xml:space="preserve"> </w:t>
-            </w:r>
-            <w:r>
-              <w:t xml:space="preserve">0.035%; misnumbered records 24</w:t>
-            </w:r>
-            <w:r>
-              <w:t xml:space="preserve"> </w:t>
-            </w:r>
-            <m:oMath>
-              <m:r>
-                <m:rPr>
-                  <m:sty m:val="p"/>
-                </m:rPr>
-                <m:t>→</m:t>
-              </m:r>
-            </m:oMath>
-            <w:r>
-              <w:t xml:space="preserve"> </w:t>
-            </w:r>
-            <w:r>
-              <w:t xml:space="preserve">16</w:t>
-            </w:r>
-            <w:r>
-              <w:t xml:space="preserve"> </w:t>
-            </w:r>
-            <m:oMath>
-              <m:r>
-                <m:rPr>
-                  <m:sty m:val="p"/>
-                </m:rPr>
-                <m:t>→</m:t>
-              </m:r>
-            </m:oMath>
-            <w:r>
-              <w:t xml:space="preserve"> </w:t>
-            </w:r>
-            <w:r>
-              <w:t xml:space="preserve">0; evaluable 5</w:t>
-            </w:r>
-            <w:r>
-              <w:t xml:space="preserve">,</w:t>
-            </w:r>
-            <w:r>
-              <w:t xml:space="preserve">560 / 5</w:t>
-            </w:r>
-            <w:r>
-              <w:t xml:space="preserve">,</w:t>
-            </w:r>
-            <w:r>
-              <w:t xml:space="preserve">670 / 5</w:t>
-            </w:r>
-            <w:r>
-              <w:t xml:space="preserve">,</w:t>
-            </w:r>
-            <w:r>
-              <w:t xml:space="preserve">749</w:t>
-            </w:r>
-          </w:p>
-        </w:tc>
-      </w:tr>
-      <w:tr>
-        <w:tc>
-          <w:tcPr/>
-          <w:p>
-            <w:pPr>
-              <w:pStyle w:val="Compact"/>
-              <w:jc w:val="left"/>
-            </w:pPr>
-            <w:r>
-              <w:t xml:space="preserve">Physiological envelope</w:t>
-            </w:r>
-          </w:p>
-        </w:tc>
-        <w:tc>
-          <w:tcPr/>
-          <w:p>
-            <w:pPr>
-              <w:pStyle w:val="Compact"/>
-              <w:jc w:val="left"/>
-            </w:pPr>
-            <w:r>
-              <w:t xml:space="preserve">release, report</w:t>
-            </w:r>
-          </w:p>
-        </w:tc>
-        <w:tc>
-          <w:tcPr/>
-          <w:p>
-            <w:pPr>
-              <w:pStyle w:val="Compact"/>
-              <w:jc w:val="left"/>
-            </w:pPr>
-            <w:r>
-              <w:t xml:space="preserve">391 of</w:t>
-            </w:r>
-            <w:r>
-              <w:t xml:space="preserve"> </w:t>
-            </w:r>
-            <m:oMath>
-              <m:r>
-                <m:rPr>
-                  <m:sty m:val="p"/>
-                </m:rPr>
-                <m:t>∼</m:t>
-              </m:r>
-            </m:oMath>
-            <w:r>
-              <w:t xml:space="preserve">75</w:t>
-            </w:r>
-            <w:r>
-              <w:t xml:space="preserve">,</w:t>
-            </w:r>
-            <w:r>
-              <w:t xml:space="preserve">000 values</w:t>
+              <w:t xml:space="preserve">0.035%/0</w:t>
             </w:r>
           </w:p>
         </w:tc>

</xml_diff>

<commit_message>
Rib table: each check, flagged before and after the student corrections
Co-Authored-By: Claude Fable 5.1 <noreply@anthropic.com>
</commit_message>
<xml_diff>
--- a/paper/mpda/CTSpinoPelvic1K_single_column.docx
+++ b/paper/mpda/CTSpinoPelvic1K_single_column.docx
@@ -2648,7 +2648,13 @@
         <w:t xml:space="preserve"> </w:t>
       </w:r>
       <w:r>
-        <w:t xml:space="preserve">148 were reviewed and corrected, and four were not and are identified in the release.</w:t>
+        <w:t xml:space="preserve">148 were reviewed and corrected, and four were not and are identified in the release, which</w:t>
+      </w:r>
+      <w:r>
+        <w:t xml:space="preserve"> </w:t>
+      </w:r>
+      <w:r>
+        <w:t xml:space="preserve">is where the residue in the first two rows sits.</w:t>
       </w:r>
       <w:r>
         <w:t xml:space="preserve"> </w:t>
@@ -2696,61 +2702,26 @@
         <w:pStyle w:val="TableCaption"/>
       </w:pPr>
       <w:r>
-        <w:t xml:space="preserve">Rib quality control by stage. Gates block a save or a release; rules run after</w:t>
-      </w:r>
-      <w:r>
-        <w:t xml:space="preserve"> </w:t>
-      </w:r>
-      <w:r>
-        <w:t xml:space="preserve">review. Incidence: raw pseudolabel</w:t>
-      </w:r>
-      <w:r>
-        <w:t xml:space="preserve"> </w:t>
-      </w:r>
-      <m:oMath>
-        <m:r>
-          <m:rPr>
-            <m:sty m:val="p"/>
-          </m:rPr>
-          <m:t>→</m:t>
-        </m:r>
-      </m:oMath>
-      <w:r>
-        <w:t xml:space="preserve"> </w:t>
-      </w:r>
-      <w:r>
-        <w:t xml:space="preserve">after student correction</w:t>
-      </w:r>
-      <w:r>
-        <w:t xml:space="preserve"> </w:t>
-      </w:r>
-      <m:oMath>
-        <m:r>
-          <m:rPr>
-            <m:sty m:val="p"/>
-          </m:rPr>
-          <m:t>→</m:t>
-        </m:r>
-      </m:oMath>
-      <w:r>
-        <w:t xml:space="preserve"> </w:t>
-      </w:r>
-      <w:r>
-        <w:t xml:space="preserve">release.</w:t>
+        <w:t xml:space="preserve">Rib checks on the raw pseudolabel and after the student corrections. The first two</w:t>
+      </w:r>
+      <w:r>
+        <w:t xml:space="preserve"> </w:t>
+      </w:r>
+      <w:r>
+        <w:t xml:space="preserve">gated the review; the rest were measured on every record at both stages.</w:t>
       </w:r>
     </w:p>
     <w:tbl>
       <w:tblPr>
         <w:tblStyle w:val="Table"/>
-        <w:tblW w:type="pct" w:w="3050"/>
-        <w:tblLayout w:type="fixed"/>
+        <w:tblW w:type="auto" w:w="0"/>
         <w:tblLook w:firstRow="1" w:lastRow="0" w:firstColumn="0" w:lastColumn="0" w:noHBand="0" w:noVBand="0" w:val="0020"/>
-        <w:tblCaption w:val="Rib quality control by stage. Gates block a save or a release; rules run after review. Incidence: raw pseudolabel \rightarrow after student correction \rightarrow release."/>
+        <w:tblCaption w:val="Rib checks on the raw pseudolabel and after the student corrections. The first two gated the review; the rest were measured on every record at both stages."/>
       </w:tblPr>
       <w:tblGrid>
-        <w:gridCol w:w="0"/>
-        <w:gridCol w:w="2692"/>
-        <w:gridCol w:w="2138"/>
+        <w:gridCol w:w="2640"/>
+        <w:gridCol w:w="2640"/>
+        <w:gridCol w:w="2640"/>
       </w:tblGrid>
       <w:tr>
         <w:trPr>
@@ -2764,7 +2735,7 @@
               <w:jc w:val="left"/>
             </w:pPr>
             <w:r>
-              <w:t xml:space="preserve">Stage</w:t>
+              <w:t xml:space="preserve">Check</w:t>
             </w:r>
           </w:p>
         </w:tc>
@@ -2773,10 +2744,10 @@
           <w:p>
             <w:pPr>
               <w:pStyle w:val="Compact"/>
-              <w:jc w:val="left"/>
+              <w:jc w:val="right"/>
             </w:pPr>
             <w:r>
-              <w:t xml:space="preserve">Checks</w:t>
+              <w:t xml:space="preserve">Before</w:t>
             </w:r>
           </w:p>
         </w:tc>
@@ -2785,10 +2756,10 @@
           <w:p>
             <w:pPr>
               <w:pStyle w:val="Compact"/>
-              <w:jc w:val="left"/>
+              <w:jc w:val="right"/>
             </w:pPr>
             <w:r>
-              <w:t xml:space="preserve">Finding</w:t>
+              <w:t xml:space="preserve">After</w:t>
             </w:r>
           </w:p>
         </w:tc>
@@ -2802,7 +2773,7 @@
               <w:jc w:val="left"/>
             </w:pPr>
             <w:r>
-              <w:t xml:space="preserve">Triage gates</w:t>
+              <w:t xml:space="preserve">One rib bone, two numbers (records / bones)</w:t>
             </w:r>
           </w:p>
         </w:tc>
@@ -2811,10 +2782,10 @@
           <w:p>
             <w:pPr>
               <w:pStyle w:val="Compact"/>
-              <w:jc w:val="left"/>
+              <w:jc w:val="right"/>
             </w:pPr>
             <w:r>
-              <w:t xml:space="preserve">one bone, one number; rib reaches the spine</w:t>
+              <w:t xml:space="preserve">151 / 584</w:t>
             </w:r>
           </w:p>
         </w:tc>
@@ -2823,10 +2794,10 @@
           <w:p>
             <w:pPr>
               <w:pStyle w:val="Compact"/>
-              <w:jc w:val="left"/>
+              <w:jc w:val="right"/>
             </w:pPr>
             <w:r>
-              <w:t xml:space="preserve">152 records, 584 bones</w:t>
+              <w:t xml:space="preserve">3 / —</w:t>
             </w:r>
           </w:p>
         </w:tc>
@@ -2840,7 +2811,7 @@
               <w:jc w:val="left"/>
             </w:pPr>
             <w:r>
-              <w:t xml:space="preserve">Review gates</w:t>
+              <w:t xml:space="preserve">Rib detached from the spine (records)</w:t>
             </w:r>
           </w:p>
         </w:tc>
@@ -2849,32 +2820,10 @@
           <w:p>
             <w:pPr>
               <w:pStyle w:val="Compact"/>
-              <w:jc w:val="left"/>
+              <w:jc w:val="right"/>
             </w:pPr>
             <w:r>
-              <w:t xml:space="preserve">one piece; consecutive; rib</w:t>
-            </w:r>
-            <w:r>
-              <w:t xml:space="preserve"> </w:t>
-            </w:r>
-            <m:oMath>
-              <m:r>
-                <m:t>N</m:t>
-              </m:r>
-            </m:oMath>
-            <w:r>
-              <w:t xml:space="preserve"> </w:t>
-            </w:r>
-            <w:r>
-              <w:t xml:space="preserve">on T</w:t>
-            </w:r>
-            <m:oMath>
-              <m:r>
-                <m:t>N</m:t>
-              </m:r>
-            </m:oMath>
-            <w:r>
-              <w:t xml:space="preserve">; spine untouched</w:t>
+              <w:t xml:space="preserve">38</w:t>
             </w:r>
           </w:p>
         </w:tc>
@@ -2883,10 +2832,10 @@
           <w:p>
             <w:pPr>
               <w:pStyle w:val="Compact"/>
-              <w:jc w:val="left"/>
+              <w:jc w:val="right"/>
             </w:pPr>
             <w:r>
-              <w:t xml:space="preserve">148 corrected, 4 not</w:t>
+              <w:t xml:space="preserve">2</w:t>
             </w:r>
           </w:p>
         </w:tc>
@@ -2900,7 +2849,7 @@
               <w:jc w:val="left"/>
             </w:pPr>
             <w:r>
-              <w:t xml:space="preserve">Rules</w:t>
+              <w:t xml:space="preserve">One number in several pieces (records / pieces)</w:t>
             </w:r>
           </w:p>
         </w:tc>
@@ -2909,27 +2858,16 @@
           <w:p>
             <w:pPr>
               <w:pStyle w:val="Compact"/>
-              <w:jc w:val="left"/>
+              <w:jc w:val="right"/>
             </w:pPr>
             <w:r>
-              <w:t xml:space="preserve">lumbar rib</w:t>
-            </w:r>
-            <w:r>
-              <w:t xml:space="preserve"> </w:t>
-            </w:r>
-            <m:oMath>
-              <m:r>
-                <m:rPr>
-                  <m:sty m:val="p"/>
-                </m:rPr>
-                <m:t>→</m:t>
-              </m:r>
-            </m:oMath>
-            <w:r>
-              <w:t xml:space="preserve"> </w:t>
-            </w:r>
-            <w:r>
-              <w:t xml:space="preserve">60/61; cage shift; anchor and count</w:t>
+              <w:t xml:space="preserve">463 / 1</w:t>
+            </w:r>
+            <w:r>
+              <w:t xml:space="preserve">,</w:t>
+            </w:r>
+            <w:r>
+              <w:t xml:space="preserve">146</w:t>
             </w:r>
           </w:p>
         </w:tc>
@@ -2938,10 +2876,10 @@
           <w:p>
             <w:pPr>
               <w:pStyle w:val="Compact"/>
-              <w:jc w:val="left"/>
+              <w:jc w:val="right"/>
             </w:pPr>
             <w:r>
-              <w:t xml:space="preserve">16 records; 11 of 27 shifted</w:t>
+              <w:t xml:space="preserve">330 / 378</w:t>
             </w:r>
           </w:p>
         </w:tc>
@@ -2955,7 +2893,7 @@
               <w:jc w:val="left"/>
             </w:pPr>
             <w:r>
-              <w:t xml:space="preserve">Release gates</w:t>
+              <w:t xml:space="preserve">Rib offset from its vertebra (ribs / records)</w:t>
             </w:r>
           </w:p>
         </w:tc>
@@ -2964,10 +2902,10 @@
           <w:p>
             <w:pPr>
               <w:pStyle w:val="Compact"/>
-              <w:jc w:val="left"/>
+              <w:jc w:val="right"/>
             </w:pPr>
             <w:r>
-              <w:t xml:space="preserve">geometry, ids, sides; physiological envelope</w:t>
+              <w:t xml:space="preserve">170 / 24</w:t>
             </w:r>
           </w:p>
         </w:tc>
@@ -2976,30 +2914,10 @@
           <w:p>
             <w:pPr>
               <w:pStyle w:val="Compact"/>
-              <w:jc w:val="left"/>
+              <w:jc w:val="right"/>
             </w:pPr>
             <w:r>
-              <w:t xml:space="preserve">802/802; 391 of</w:t>
-            </w:r>
-            <w:r>
-              <w:t xml:space="preserve"> </w:t>
-            </w:r>
-            <m:oMath>
-              <m:r>
-                <m:rPr>
-                  <m:sty m:val="p"/>
-                </m:rPr>
-                <m:t>∼</m:t>
-              </m:r>
-            </m:oMath>
-            <w:r>
-              <w:t xml:space="preserve">75</w:t>
-            </w:r>
-            <w:r>
-              <w:t xml:space="preserve">,</w:t>
-            </w:r>
-            <w:r>
-              <w:t xml:space="preserve">000 values</w:t>
+              <w:t xml:space="preserve">109 / 16</w:t>
             </w:r>
           </w:p>
         </w:tc>
@@ -3013,7 +2931,7 @@
               <w:jc w:val="left"/>
             </w:pPr>
             <w:r>
-              <w:t xml:space="preserve">Incidence</w:t>
+              <w:t xml:space="preserve">Rib with no vertebra within reach (ribs)</w:t>
             </w:r>
           </w:p>
         </w:tc>
@@ -3022,10 +2940,10 @@
           <w:p>
             <w:pPr>
               <w:pStyle w:val="Compact"/>
-              <w:jc w:val="left"/>
+              <w:jc w:val="right"/>
             </w:pPr>
             <w:r>
-              <w:t xml:space="preserve">offset ribs / misnumbered records</w:t>
+              <w:t xml:space="preserve">38</w:t>
             </w:r>
           </w:p>
         </w:tc>
@@ -3034,44 +2952,48 @@
           <w:p>
             <w:pPr>
               <w:pStyle w:val="Compact"/>
+              <w:jc w:val="right"/>
+            </w:pPr>
+            <w:r>
+              <w:t xml:space="preserve">12</w:t>
+            </w:r>
+          </w:p>
+        </w:tc>
+      </w:tr>
+      <w:tr>
+        <w:tc>
+          <w:tcPr/>
+          <w:p>
+            <w:pPr>
+              <w:pStyle w:val="Compact"/>
               <w:jc w:val="left"/>
             </w:pPr>
             <w:r>
-              <w:t xml:space="preserve">3.1%/24</w:t>
-            </w:r>
-            <w:r>
-              <w:t xml:space="preserve"> </w:t>
-            </w:r>
-            <m:oMath>
-              <m:r>
-                <m:rPr>
-                  <m:sty m:val="p"/>
-                </m:rPr>
-                <m:t>→</m:t>
-              </m:r>
-            </m:oMath>
-            <w:r>
-              <w:t xml:space="preserve"> </w:t>
-            </w:r>
-            <w:r>
-              <w:t xml:space="preserve">1.9%/16</w:t>
-            </w:r>
-            <w:r>
-              <w:t xml:space="preserve"> </w:t>
-            </w:r>
-            <m:oMath>
-              <m:r>
-                <m:rPr>
-                  <m:sty m:val="p"/>
-                </m:rPr>
-                <m:t>→</m:t>
-              </m:r>
-            </m:oMath>
-            <w:r>
-              <w:t xml:space="preserve"> </w:t>
-            </w:r>
-            <w:r>
-              <w:t xml:space="preserve">0.035%/0</w:t>
+              <w:t xml:space="preserve">Rib on a lumbar body, numbered thoracic (ribs)</w:t>
+            </w:r>
+          </w:p>
+        </w:tc>
+        <w:tc>
+          <w:tcPr/>
+          <w:p>
+            <w:pPr>
+              <w:pStyle w:val="Compact"/>
+              <w:jc w:val="right"/>
+            </w:pPr>
+            <w:r>
+              <w:t xml:space="preserve">21</w:t>
+            </w:r>
+          </w:p>
+        </w:tc>
+        <w:tc>
+          <w:tcPr/>
+          <w:p>
+            <w:pPr>
+              <w:pStyle w:val="Compact"/>
+              <w:jc w:val="right"/>
+            </w:pPr>
+            <w:r>
+              <w:t xml:space="preserve">25</w:t>
             </w:r>
           </w:p>
         </w:tc>

</xml_diff>

<commit_message>
Rib table fits its column
Co-Authored-By: Claude Fable 5.1 <noreply@anthropic.com>
</commit_message>
<xml_diff>
--- a/paper/mpda/CTSpinoPelvic1K_single_column.docx
+++ b/paper/mpda/CTSpinoPelvic1K_single_column.docx
@@ -2708,7 +2708,13 @@
         <w:t xml:space="preserve"> </w:t>
       </w:r>
       <w:r>
-        <w:t xml:space="preserve">gated the review; the rest were measured on every record at both stages.</w:t>
+        <w:t xml:space="preserve">gated the review; the rest were measured on every record at both stages. Pairs are records /</w:t>
+      </w:r>
+      <w:r>
+        <w:t xml:space="preserve"> </w:t>
+      </w:r>
+      <w:r>
+        <w:t xml:space="preserve">ribs, or records / pieces.</w:t>
       </w:r>
     </w:p>
     <w:tbl>
@@ -2716,7 +2722,7 @@
         <w:tblStyle w:val="Table"/>
         <w:tblW w:type="auto" w:w="0"/>
         <w:tblLook w:firstRow="1" w:lastRow="0" w:firstColumn="0" w:lastColumn="0" w:noHBand="0" w:noVBand="0" w:val="0020"/>
-        <w:tblCaption w:val="Rib checks on the raw pseudolabel and after the student corrections. The first two gated the review; the rest were measured on every record at both stages."/>
+        <w:tblCaption w:val="Rib checks on the raw pseudolabel and after the student corrections. The first two gated the review; the rest were measured on every record at both stages. Pairs are records / ribs, or records / pieces."/>
       </w:tblPr>
       <w:tblGrid>
         <w:gridCol w:w="2640"/>
@@ -2773,7 +2779,7 @@
               <w:jc w:val="left"/>
             </w:pPr>
             <w:r>
-              <w:t xml:space="preserve">One rib bone, two numbers (records / bones)</w:t>
+              <w:t xml:space="preserve">Two numbers on one bone</w:t>
             </w:r>
           </w:p>
         </w:tc>
@@ -2811,7 +2817,7 @@
               <w:jc w:val="left"/>
             </w:pPr>
             <w:r>
-              <w:t xml:space="preserve">Rib detached from the spine (records)</w:t>
+              <w:t xml:space="preserve">Rib detached from the spine</w:t>
             </w:r>
           </w:p>
         </w:tc>
@@ -2849,7 +2855,7 @@
               <w:jc w:val="left"/>
             </w:pPr>
             <w:r>
-              <w:t xml:space="preserve">One number in several pieces (records / pieces)</w:t>
+              <w:t xml:space="preserve">Number in several pieces</w:t>
             </w:r>
           </w:p>
         </w:tc>
@@ -2893,7 +2899,7 @@
               <w:jc w:val="left"/>
             </w:pPr>
             <w:r>
-              <w:t xml:space="preserve">Rib offset from its vertebra (ribs / records)</w:t>
+              <w:t xml:space="preserve">Rib offset from its vertebra</w:t>
             </w:r>
           </w:p>
         </w:tc>
@@ -2905,7 +2911,7 @@
               <w:jc w:val="right"/>
             </w:pPr>
             <w:r>
-              <w:t xml:space="preserve">170 / 24</w:t>
+              <w:t xml:space="preserve">24 / 170</w:t>
             </w:r>
           </w:p>
         </w:tc>
@@ -2917,7 +2923,7 @@
               <w:jc w:val="right"/>
             </w:pPr>
             <w:r>
-              <w:t xml:space="preserve">109 / 16</w:t>
+              <w:t xml:space="preserve">16 / 109</w:t>
             </w:r>
           </w:p>
         </w:tc>
@@ -2931,7 +2937,7 @@
               <w:jc w:val="left"/>
             </w:pPr>
             <w:r>
-              <w:t xml:space="preserve">Rib with no vertebra within reach (ribs)</w:t>
+              <w:t xml:space="preserve">No vertebra within reach</w:t>
             </w:r>
           </w:p>
         </w:tc>
@@ -2943,7 +2949,7 @@
               <w:jc w:val="right"/>
             </w:pPr>
             <w:r>
-              <w:t xml:space="preserve">38</w:t>
+              <w:t xml:space="preserve">— / 38</w:t>
             </w:r>
           </w:p>
         </w:tc>
@@ -2955,7 +2961,7 @@
               <w:jc w:val="right"/>
             </w:pPr>
             <w:r>
-              <w:t xml:space="preserve">12</w:t>
+              <w:t xml:space="preserve">— / 12</w:t>
             </w:r>
           </w:p>
         </w:tc>
@@ -2969,7 +2975,7 @@
               <w:jc w:val="left"/>
             </w:pPr>
             <w:r>
-              <w:t xml:space="preserve">Rib on a lumbar body, numbered thoracic (ribs)</w:t>
+              <w:t xml:space="preserve">Rib on a lumbar body</w:t>
             </w:r>
           </w:p>
         </w:tc>
@@ -2981,7 +2987,7 @@
               <w:jc w:val="right"/>
             </w:pPr>
             <w:r>
-              <w:t xml:space="preserve">21</w:t>
+              <w:t xml:space="preserve">— / 21</w:t>
             </w:r>
           </w:p>
         </w:tc>
@@ -2993,7 +2999,7 @@
               <w:jc w:val="right"/>
             </w:pPr>
             <w:r>
-              <w:t xml:space="preserve">25</w:t>
+              <w:t xml:space="preserve">— / 25</w:t>
             </w:r>
           </w:p>
         </w:tc>

</xml_diff>